<commit_message>
todo: uopdate research tab
</commit_message>
<xml_diff>
--- a/docs/Technical Resume Template.docx
+++ b/docs/Technical Resume Template.docx
@@ -68,8 +68,38 @@
           <w:sz w:val="20"/>
           <w:szCs w:val="20"/>
         </w:rPr>
-        <w:t xml:space="preserve"> • LinkedIn • github link</w:t>
-      </w:r>
+        <w:t xml:space="preserve"> • </w:t>
+      </w:r>
+      <w:hyperlink r:id="rId5" w:history="1">
+        <w:r>
+          <w:rPr>
+            <w:rStyle w:val="a6"/>
+            <w:rFonts w:ascii="Spectral" w:eastAsia="Spectral" w:hAnsi="Spectral" w:cs="Spectral"/>
+            <w:sz w:val="20"/>
+            <w:szCs w:val="20"/>
+          </w:rPr>
+          <w:t>LinkedIn</w:t>
+        </w:r>
+      </w:hyperlink>
+      <w:r>
+        <w:rPr>
+          <w:rFonts w:ascii="Spectral" w:eastAsia="Spectral" w:hAnsi="Spectral" w:cs="Spectral"/>
+          <w:sz w:val="20"/>
+          <w:szCs w:val="20"/>
+        </w:rPr>
+        <w:t xml:space="preserve"> • </w:t>
+      </w:r>
+      <w:hyperlink r:id="rId6" w:history="1">
+        <w:r>
+          <w:rPr>
+            <w:rStyle w:val="a6"/>
+            <w:rFonts w:ascii="Spectral" w:eastAsia="Spectral" w:hAnsi="Spectral" w:cs="Spectral"/>
+            <w:sz w:val="20"/>
+            <w:szCs w:val="20"/>
+          </w:rPr>
+          <w:t>github link</w:t>
+        </w:r>
+      </w:hyperlink>
     </w:p>
     <w:p>
       <w:pPr>
@@ -212,7 +242,27 @@
           <w:szCs w:val="20"/>
           <w:lang w:eastAsia="ko-KR"/>
         </w:rPr>
-        <w:t>4.36 / 4.5</w:t>
+        <w:t>4.3</w:t>
+      </w:r>
+      <w:r>
+        <w:rPr>
+          <w:rFonts w:ascii="Spectral" w:hAnsi="Spectral" w:cs="Spectral" w:hint="eastAsia"/>
+          <w:b/>
+          <w:sz w:val="20"/>
+          <w:szCs w:val="20"/>
+          <w:lang w:eastAsia="ko-KR"/>
+        </w:rPr>
+        <w:t>8</w:t>
+      </w:r>
+      <w:r>
+        <w:rPr>
+          <w:rFonts w:ascii="Spectral" w:hAnsi="Spectral" w:cs="Spectral" w:hint="eastAsia"/>
+          <w:b/>
+          <w:sz w:val="20"/>
+          <w:szCs w:val="20"/>
+          <w:lang w:eastAsia="ko-KR"/>
+        </w:rPr>
+        <w:t xml:space="preserve"> / 4.5</w:t>
       </w:r>
       <w:r>
         <w:rPr>
@@ -309,23 +359,14 @@
           <w:szCs w:val="22"/>
           <w:lang w:eastAsia="ko-KR"/>
         </w:rPr>
-        <w:t>Jun 202</w:t>
-      </w:r>
-      <w:r>
-        <w:rPr>
-          <w:rFonts w:ascii="Spectral" w:hAnsi="Spectral" w:cs="Spectral" w:hint="eastAsia"/>
-          <w:b/>
-          <w:sz w:val="22"/>
-          <w:szCs w:val="22"/>
-          <w:lang w:eastAsia="ko-KR"/>
-        </w:rPr>
-        <w:t>6</w:t>
-      </w:r>
-    </w:p>
-    <w:p>
-      <w:pPr>
-        <w:rPr>
-          <w:rFonts w:ascii="Spectral" w:hAnsi="Spectral" w:cs="Spectral" w:hint="eastAsia"/>
+        <w:t>Jun 2026</w:t>
+      </w:r>
+    </w:p>
+    <w:p>
+      <w:pPr>
+        <w:rPr>
+          <w:rFonts w:ascii="Spectral" w:hAnsi="Spectral" w:cs="Spectral"/>
+          <w:b/>
           <w:sz w:val="20"/>
           <w:szCs w:val="20"/>
           <w:lang w:eastAsia="ko-KR"/>
@@ -377,7 +418,7 @@
           <w:szCs w:val="20"/>
           <w:lang w:eastAsia="ko-KR"/>
         </w:rPr>
-        <w:t xml:space="preserve">Computer Graphics, Data Structures, </w:t>
+        <w:t xml:space="preserve">Computer Graphics, </w:t>
       </w:r>
       <w:r>
         <w:rPr>
@@ -417,262 +458,37 @@
           <w:szCs w:val="20"/>
           <w:lang w:eastAsia="ko-KR"/>
         </w:rPr>
+        <w:t xml:space="preserve">Data Structures, </w:t>
+      </w:r>
+      <w:r>
+        <w:rPr>
+          <w:rFonts w:ascii="Spectral" w:hAnsi="Spectral" w:cs="Spectral"/>
+          <w:b/>
+          <w:sz w:val="20"/>
+          <w:szCs w:val="20"/>
+          <w:lang w:eastAsia="ko-KR"/>
+        </w:rPr>
         <w:t>Computer Vision</w:t>
       </w:r>
-    </w:p>
-    <w:p>
-      <w:pPr>
-        <w:rPr>
-          <w:rFonts w:ascii="Spectral" w:eastAsia="Spectral" w:hAnsi="Spectral" w:cs="Spectral"/>
-          <w:sz w:val="11"/>
-          <w:szCs w:val="11"/>
-        </w:rPr>
-      </w:pPr>
-    </w:p>
-    <w:p>
-      <w:pPr>
-        <w:pBdr>
-          <w:bottom w:val="single" w:sz="6" w:space="1" w:color="000000"/>
-        </w:pBdr>
-        <w:rPr>
-          <w:rFonts w:ascii="Spectral" w:eastAsia="Spectral" w:hAnsi="Spectral" w:cs="Spectral"/>
-          <w:sz w:val="22"/>
-          <w:szCs w:val="22"/>
-        </w:rPr>
-      </w:pPr>
-      <w:r>
-        <w:rPr>
-          <w:rFonts w:ascii="Spectral" w:eastAsia="Spectral" w:hAnsi="Spectral" w:cs="Spectral"/>
-          <w:b/>
-          <w:smallCaps/>
-          <w:sz w:val="22"/>
-          <w:szCs w:val="22"/>
-        </w:rPr>
-        <w:t>TECHNICAL SKILLS</w:t>
-      </w:r>
-    </w:p>
-    <w:p>
-      <w:pPr>
-        <w:rPr>
-          <w:rFonts w:ascii="Spectral" w:eastAsia="Spectral" w:hAnsi="Spectral" w:cs="Spectral"/>
-          <w:sz w:val="8"/>
-          <w:szCs w:val="8"/>
-        </w:rPr>
-      </w:pPr>
+      <w:r>
+        <w:rPr>
+          <w:rFonts w:ascii="Spectral" w:hAnsi="Spectral" w:cs="Spectral" w:hint="eastAsia"/>
+          <w:b/>
+          <w:sz w:val="20"/>
+          <w:szCs w:val="20"/>
+          <w:lang w:eastAsia="ko-KR"/>
+        </w:rPr>
+        <w:t>, Digital Signal Processing, Electrical Engineering</w:t>
+      </w:r>
     </w:p>
     <w:p>
       <w:pPr>
         <w:rPr>
           <w:rFonts w:ascii="Spectral" w:hAnsi="Spectral" w:cs="Spectral"/>
-          <w:sz w:val="20"/>
-          <w:szCs w:val="20"/>
-          <w:lang w:eastAsia="ko-KR"/>
-        </w:rPr>
-      </w:pPr>
-      <w:r>
-        <w:rPr>
-          <w:rFonts w:ascii="Spectral" w:eastAsia="Spectral" w:hAnsi="Spectral" w:cs="Spectral"/>
-          <w:b/>
-          <w:sz w:val="20"/>
-          <w:szCs w:val="20"/>
-        </w:rPr>
-        <w:t>Programming Languages:</w:t>
-      </w:r>
-      <w:r>
-        <w:rPr>
-          <w:rFonts w:ascii="Spectral" w:eastAsia="Spectral" w:hAnsi="Spectral" w:cs="Spectral"/>
-          <w:sz w:val="20"/>
-          <w:szCs w:val="20"/>
-        </w:rPr>
-        <w:t xml:space="preserve"> </w:t>
-      </w:r>
-      <w:r>
-        <w:rPr>
-          <w:rFonts w:ascii="Spectral" w:eastAsia="Spectral" w:hAnsi="Spectral" w:cs="Spectral"/>
-          <w:sz w:val="20"/>
-          <w:szCs w:val="20"/>
-        </w:rPr>
-        <w:t>C++, C, Python, JavaScript, GLSL</w:t>
-      </w:r>
-      <w:r>
-        <w:rPr>
-          <w:rFonts w:ascii="Spectral" w:hAnsi="Spectral" w:cs="Spectral"/>
-          <w:sz w:val="20"/>
-          <w:szCs w:val="20"/>
-          <w:lang w:eastAsia="ko-KR"/>
-        </w:rPr>
-        <w:t xml:space="preserve">, </w:t>
-      </w:r>
-      <w:r>
-        <w:rPr>
-          <w:rFonts w:ascii="Spectral" w:eastAsia="Spectral" w:hAnsi="Spectral" w:cs="Spectral"/>
-          <w:sz w:val="20"/>
-          <w:szCs w:val="20"/>
-        </w:rPr>
-        <w:t>C#</w:t>
-      </w:r>
-    </w:p>
-    <w:p>
-      <w:pPr>
-        <w:rPr>
-          <w:rFonts w:ascii="Spectral" w:hAnsi="Spectral" w:cs="Spectral"/>
-          <w:bCs/>
-          <w:sz w:val="20"/>
-          <w:szCs w:val="20"/>
-          <w:lang w:eastAsia="ko-KR"/>
-        </w:rPr>
-      </w:pPr>
-      <w:r>
-        <w:rPr>
-          <w:rFonts w:ascii="Spectral" w:hAnsi="Spectral" w:cs="Spectral"/>
-          <w:b/>
-          <w:sz w:val="20"/>
-          <w:szCs w:val="20"/>
-          <w:lang w:eastAsia="ko-KR"/>
-        </w:rPr>
-        <w:t>Frameworks &amp; Libraries</w:t>
-      </w:r>
-      <w:r>
-        <w:rPr>
-          <w:rFonts w:ascii="Spectral" w:eastAsia="Spectral" w:hAnsi="Spectral" w:cs="Spectral"/>
-          <w:b/>
-          <w:sz w:val="20"/>
-          <w:szCs w:val="20"/>
-        </w:rPr>
-        <w:t xml:space="preserve">: </w:t>
-      </w:r>
-      <w:r>
-        <w:rPr>
-          <w:rFonts w:ascii="Spectral" w:eastAsia="Spectral" w:hAnsi="Spectral" w:cs="Spectral"/>
-          <w:bCs/>
-          <w:sz w:val="20"/>
-          <w:szCs w:val="20"/>
-        </w:rPr>
-        <w:t>OpenCV, PyTorch, CUDA, OpenGL, WebGL, Unity, ROS 1/2</w:t>
-      </w:r>
-    </w:p>
-    <w:p>
-      <w:pPr>
-        <w:rPr>
-          <w:rFonts w:ascii="Spectral" w:hAnsi="Spectral" w:cs="Spectral"/>
-          <w:sz w:val="20"/>
-          <w:szCs w:val="20"/>
-          <w:lang w:eastAsia="ko-KR"/>
-        </w:rPr>
-      </w:pPr>
-      <w:r>
-        <w:rPr>
-          <w:rFonts w:ascii="Spectral" w:hAnsi="Spectral" w:cs="Spectral"/>
-          <w:b/>
-          <w:sz w:val="20"/>
-          <w:szCs w:val="20"/>
-          <w:lang w:eastAsia="ko-KR"/>
-        </w:rPr>
-        <w:t>Tools &amp; Systems</w:t>
-      </w:r>
-      <w:r>
-        <w:rPr>
-          <w:rFonts w:ascii="Spectral" w:eastAsia="Spectral" w:hAnsi="Spectral" w:cs="Spectral"/>
-          <w:b/>
-          <w:sz w:val="20"/>
-          <w:szCs w:val="20"/>
-        </w:rPr>
-        <w:t xml:space="preserve">: </w:t>
-      </w:r>
-      <w:r>
-        <w:rPr>
-          <w:rFonts w:ascii="Spectral" w:hAnsi="Spectral" w:cs="Spectral"/>
-          <w:bCs/>
-          <w:sz w:val="20"/>
-          <w:szCs w:val="20"/>
-          <w:lang w:eastAsia="ko-KR"/>
-        </w:rPr>
-        <w:t>Linux (Ubuntu), CMake, Git/GitHub</w:t>
-      </w:r>
-    </w:p>
-    <w:p>
-      <w:pPr>
-        <w:rPr>
-          <w:rFonts w:ascii="Spectral" w:hAnsi="Spectral" w:cs="Spectral"/>
-          <w:sz w:val="20"/>
-          <w:szCs w:val="20"/>
-          <w:lang w:eastAsia="ko-KR"/>
-        </w:rPr>
-      </w:pPr>
-      <w:r>
-        <w:rPr>
-          <w:rFonts w:ascii="Spectral" w:eastAsia="Spectral" w:hAnsi="Spectral" w:cs="Spectral"/>
-          <w:b/>
-          <w:sz w:val="20"/>
-          <w:szCs w:val="20"/>
-        </w:rPr>
-        <w:t>Interpersonal Skills</w:t>
-      </w:r>
-      <w:r>
-        <w:rPr>
-          <w:rFonts w:ascii="Spectral" w:eastAsia="Spectral" w:hAnsi="Spectral" w:cs="Spectral"/>
-          <w:sz w:val="20"/>
-          <w:szCs w:val="20"/>
-        </w:rPr>
-        <w:t xml:space="preserve">: </w:t>
-      </w:r>
-      <w:r>
-        <w:rPr>
-          <w:rFonts w:ascii="Spectral" w:eastAsia="Spectral" w:hAnsi="Spectral" w:cs="Spectral"/>
-          <w:sz w:val="20"/>
-          <w:szCs w:val="20"/>
-        </w:rPr>
-        <w:t>Cross-functional Collaboration, Technical Communication, Problem Solving, Adaptability</w:t>
-      </w:r>
-    </w:p>
-    <w:p>
-      <w:pPr>
-        <w:rPr>
-          <w:rFonts w:ascii="Spectral" w:eastAsia="Spectral" w:hAnsi="Spectral" w:cs="Spectral"/>
-          <w:sz w:val="20"/>
-          <w:szCs w:val="20"/>
-        </w:rPr>
-      </w:pPr>
-    </w:p>
-    <w:p>
-      <w:pPr>
-        <w:pBdr>
-          <w:bottom w:val="single" w:sz="6" w:space="1" w:color="000000"/>
-        </w:pBdr>
-        <w:rPr>
-          <w:rFonts w:ascii="Spectral" w:eastAsia="Spectral" w:hAnsi="Spectral" w:cs="Spectral"/>
-          <w:sz w:val="22"/>
-          <w:szCs w:val="22"/>
-        </w:rPr>
-      </w:pPr>
-      <w:r>
-        <w:rPr>
-          <w:rFonts w:ascii="Spectral" w:hAnsi="Spectral" w:cs="Spectral" w:hint="eastAsia"/>
-          <w:b/>
-          <w:smallCaps/>
-          <w:sz w:val="22"/>
-          <w:szCs w:val="22"/>
-          <w:lang w:eastAsia="ko-KR"/>
-        </w:rPr>
-        <w:t>RESEARCH</w:t>
-      </w:r>
-      <w:r>
-        <w:rPr>
-          <w:rFonts w:ascii="Spectral" w:eastAsia="Spectral" w:hAnsi="Spectral" w:cs="Spectral"/>
-          <w:b/>
-          <w:smallCaps/>
-          <w:sz w:val="22"/>
-          <w:szCs w:val="22"/>
-        </w:rPr>
-        <w:t xml:space="preserve"> EXPERIENCE</w:t>
-      </w:r>
-    </w:p>
-    <w:p>
-      <w:pPr>
-        <w:rPr>
-          <w:rFonts w:ascii="Spectral" w:eastAsia="Spectral" w:hAnsi="Spectral" w:cs="Spectral"/>
-          <w:sz w:val="8"/>
-          <w:szCs w:val="8"/>
+          <w:b/>
+          <w:sz w:val="20"/>
+          <w:szCs w:val="20"/>
+          <w:lang w:eastAsia="ko-KR"/>
         </w:rPr>
       </w:pPr>
     </w:p>
@@ -683,6 +499,533 @@
           <w:tab w:val="right" w:pos="10503"/>
         </w:tabs>
         <w:rPr>
+          <w:rFonts w:ascii="Spectral" w:eastAsia="Spectral" w:hAnsi="Spectral" w:cs="Spectral" w:hint="eastAsia"/>
+          <w:sz w:val="20"/>
+          <w:szCs w:val="20"/>
+        </w:rPr>
+      </w:pPr>
+      <w:r>
+        <w:rPr>
+          <w:rFonts w:ascii="Spectral" w:hAnsi="Spectral" w:cs="Spectral" w:hint="eastAsia"/>
+          <w:b/>
+          <w:sz w:val="20"/>
+          <w:szCs w:val="20"/>
+          <w:lang w:eastAsia="ko-KR"/>
+        </w:rPr>
+        <w:t>DigiPen Institute of Technology</w:t>
+      </w:r>
+      <w:r>
+        <w:rPr>
+          <w:rFonts w:ascii="Spectral" w:eastAsia="Spectral" w:hAnsi="Spectral" w:cs="Spectral"/>
+          <w:b/>
+          <w:sz w:val="20"/>
+          <w:szCs w:val="20"/>
+        </w:rPr>
+        <w:t xml:space="preserve"> | </w:t>
+      </w:r>
+      <w:r>
+        <w:rPr>
+          <w:rFonts w:ascii="Spectral" w:hAnsi="Spectral" w:cs="Spectral" w:hint="eastAsia"/>
+          <w:b/>
+          <w:sz w:val="20"/>
+          <w:szCs w:val="20"/>
+          <w:lang w:eastAsia="ko-KR"/>
+        </w:rPr>
+        <w:t>Redmond, WA, United States</w:t>
+      </w:r>
+    </w:p>
+    <w:p>
+      <w:pPr>
+        <w:tabs>
+          <w:tab w:val="left" w:pos="1134"/>
+          <w:tab w:val="right" w:pos="11064"/>
+        </w:tabs>
+        <w:rPr>
+          <w:rFonts w:ascii="Spectral" w:hAnsi="Spectral" w:cs="Spectral" w:hint="eastAsia"/>
+          <w:sz w:val="20"/>
+          <w:szCs w:val="20"/>
+          <w:lang w:eastAsia="ko-KR"/>
+        </w:rPr>
+      </w:pPr>
+      <w:r>
+        <w:rPr>
+          <w:rFonts w:ascii="Spectral" w:hAnsi="Spectral" w:cs="Spectral" w:hint="eastAsia"/>
+          <w:b/>
+          <w:sz w:val="20"/>
+          <w:szCs w:val="20"/>
+          <w:lang w:eastAsia="ko-KR"/>
+        </w:rPr>
+        <w:t>Computer Science in Real-Time Interactive Simulation</w:t>
+      </w:r>
+      <w:r>
+        <w:rPr>
+          <w:rFonts w:ascii="Spectral" w:eastAsia="Spectral" w:hAnsi="Spectral" w:cs="Spectral"/>
+          <w:b/>
+          <w:sz w:val="20"/>
+          <w:szCs w:val="20"/>
+        </w:rPr>
+        <w:t xml:space="preserve"> | GPA: </w:t>
+      </w:r>
+      <w:r>
+        <w:rPr>
+          <w:rFonts w:ascii="Spectral" w:hAnsi="Spectral" w:cs="Spectral" w:hint="eastAsia"/>
+          <w:b/>
+          <w:sz w:val="20"/>
+          <w:szCs w:val="20"/>
+          <w:lang w:eastAsia="ko-KR"/>
+        </w:rPr>
+        <w:t>4.</w:t>
+      </w:r>
+      <w:r>
+        <w:rPr>
+          <w:rFonts w:ascii="Spectral" w:hAnsi="Spectral" w:cs="Spectral" w:hint="eastAsia"/>
+          <w:b/>
+          <w:sz w:val="20"/>
+          <w:szCs w:val="20"/>
+          <w:lang w:eastAsia="ko-KR"/>
+        </w:rPr>
+        <w:t>0</w:t>
+      </w:r>
+      <w:r>
+        <w:rPr>
+          <w:rFonts w:ascii="Spectral" w:hAnsi="Spectral" w:cs="Spectral" w:hint="eastAsia"/>
+          <w:b/>
+          <w:sz w:val="20"/>
+          <w:szCs w:val="20"/>
+          <w:lang w:eastAsia="ko-KR"/>
+        </w:rPr>
+        <w:t xml:space="preserve"> / 4.</w:t>
+      </w:r>
+      <w:r>
+        <w:rPr>
+          <w:rFonts w:ascii="Spectral" w:hAnsi="Spectral" w:cs="Spectral" w:hint="eastAsia"/>
+          <w:b/>
+          <w:sz w:val="20"/>
+          <w:szCs w:val="20"/>
+          <w:lang w:eastAsia="ko-KR"/>
+        </w:rPr>
+        <w:t>0</w:t>
+      </w:r>
+      <w:r>
+        <w:rPr>
+          <w:rFonts w:ascii="Spectral" w:eastAsia="Spectral" w:hAnsi="Spectral" w:cs="Spectral"/>
+          <w:sz w:val="20"/>
+          <w:szCs w:val="20"/>
+        </w:rPr>
+        <w:t xml:space="preserve">                                     </w:t>
+      </w:r>
+      <w:r>
+        <w:rPr>
+          <w:rFonts w:ascii="Spectral" w:eastAsia="Spectral" w:hAnsi="Spectral" w:cs="Spectral"/>
+          <w:b/>
+          <w:smallCaps/>
+          <w:sz w:val="20"/>
+          <w:szCs w:val="20"/>
+        </w:rPr>
+        <w:t xml:space="preserve">  </w:t>
+      </w:r>
+      <w:r>
+        <w:rPr>
+          <w:rFonts w:ascii="Spectral" w:eastAsia="Spectral" w:hAnsi="Spectral" w:cs="Spectral"/>
+          <w:b/>
+          <w:sz w:val="22"/>
+          <w:szCs w:val="22"/>
+        </w:rPr>
+        <w:t xml:space="preserve">   </w:t>
+      </w:r>
+      <w:r>
+        <w:rPr>
+          <w:rFonts w:ascii="Spectral" w:hAnsi="Spectral" w:cs="Spectral" w:hint="eastAsia"/>
+          <w:b/>
+          <w:sz w:val="22"/>
+          <w:szCs w:val="22"/>
+          <w:lang w:eastAsia="ko-KR"/>
+        </w:rPr>
+        <w:t xml:space="preserve">                                   </w:t>
+      </w:r>
+      <w:r>
+        <w:rPr>
+          <w:rFonts w:asciiTheme="minorEastAsia" w:hAnsiTheme="minorEastAsia" w:cs="Spectral" w:hint="eastAsia"/>
+          <w:b/>
+          <w:sz w:val="22"/>
+          <w:szCs w:val="22"/>
+          <w:lang w:eastAsia="ko-KR"/>
+        </w:rPr>
+        <w:t>Aug</w:t>
+      </w:r>
+      <w:r>
+        <w:rPr>
+          <w:rFonts w:ascii="Spectral" w:hAnsi="Spectral" w:cs="Spectral" w:hint="eastAsia"/>
+          <w:b/>
+          <w:sz w:val="22"/>
+          <w:szCs w:val="22"/>
+          <w:lang w:eastAsia="ko-KR"/>
+        </w:rPr>
+        <w:t xml:space="preserve"> 202</w:t>
+      </w:r>
+      <w:r>
+        <w:rPr>
+          <w:rFonts w:ascii="Spectral" w:hAnsi="Spectral" w:cs="Spectral" w:hint="eastAsia"/>
+          <w:b/>
+          <w:sz w:val="22"/>
+          <w:szCs w:val="22"/>
+          <w:lang w:eastAsia="ko-KR"/>
+        </w:rPr>
+        <w:t>6</w:t>
+      </w:r>
+      <w:r>
+        <w:rPr>
+          <w:rFonts w:ascii="Spectral" w:hAnsi="Spectral" w:cs="Spectral" w:hint="eastAsia"/>
+          <w:b/>
+          <w:sz w:val="22"/>
+          <w:szCs w:val="22"/>
+          <w:lang w:eastAsia="ko-KR"/>
+        </w:rPr>
+        <w:t xml:space="preserve"> </w:t>
+      </w:r>
+      <w:r>
+        <w:rPr>
+          <w:rFonts w:ascii="Spectral" w:hAnsi="Spectral" w:cs="Spectral" w:hint="eastAsia"/>
+          <w:b/>
+          <w:sz w:val="22"/>
+          <w:szCs w:val="22"/>
+          <w:lang w:eastAsia="ko-KR"/>
+        </w:rPr>
+        <w:t>–</w:t>
+      </w:r>
+      <w:r>
+        <w:rPr>
+          <w:rFonts w:ascii="Spectral" w:hAnsi="Spectral" w:cs="Spectral"/>
+          <w:b/>
+          <w:sz w:val="22"/>
+          <w:szCs w:val="22"/>
+          <w:lang w:eastAsia="ko-KR"/>
+        </w:rPr>
+        <w:t xml:space="preserve"> </w:t>
+      </w:r>
+      <w:r>
+        <w:rPr>
+          <w:rFonts w:ascii="Spectral" w:hAnsi="Spectral" w:cs="Spectral" w:hint="eastAsia"/>
+          <w:b/>
+          <w:sz w:val="22"/>
+          <w:szCs w:val="22"/>
+          <w:lang w:eastAsia="ko-KR"/>
+        </w:rPr>
+        <w:t>Upcoming</w:t>
+      </w:r>
+    </w:p>
+    <w:p>
+      <w:pPr>
+        <w:rPr>
+          <w:rFonts w:ascii="Spectral" w:hAnsi="Spectral" w:cs="Spectral" w:hint="eastAsia"/>
+          <w:sz w:val="20"/>
+          <w:szCs w:val="20"/>
+          <w:lang w:eastAsia="ko-KR"/>
+        </w:rPr>
+      </w:pPr>
+    </w:p>
+    <w:p>
+      <w:pPr>
+        <w:rPr>
+          <w:rFonts w:ascii="Spectral" w:eastAsia="Spectral" w:hAnsi="Spectral" w:cs="Spectral"/>
+          <w:sz w:val="11"/>
+          <w:szCs w:val="11"/>
+        </w:rPr>
+      </w:pPr>
+    </w:p>
+    <w:p>
+      <w:pPr>
+        <w:pBdr>
+          <w:bottom w:val="single" w:sz="6" w:space="1" w:color="000000"/>
+        </w:pBdr>
+        <w:rPr>
+          <w:rFonts w:ascii="Spectral" w:eastAsia="Spectral" w:hAnsi="Spectral" w:cs="Spectral"/>
+          <w:sz w:val="22"/>
+          <w:szCs w:val="22"/>
+        </w:rPr>
+      </w:pPr>
+      <w:r>
+        <w:rPr>
+          <w:rFonts w:ascii="Spectral" w:eastAsia="Spectral" w:hAnsi="Spectral" w:cs="Spectral"/>
+          <w:b/>
+          <w:smallCaps/>
+          <w:sz w:val="22"/>
+          <w:szCs w:val="22"/>
+        </w:rPr>
+        <w:t>TECHNICAL SKILLS</w:t>
+      </w:r>
+    </w:p>
+    <w:p>
+      <w:pPr>
+        <w:rPr>
+          <w:rFonts w:ascii="Spectral" w:eastAsia="Spectral" w:hAnsi="Spectral" w:cs="Spectral"/>
+          <w:sz w:val="8"/>
+          <w:szCs w:val="8"/>
+        </w:rPr>
+      </w:pPr>
+    </w:p>
+    <w:p>
+      <w:pPr>
+        <w:rPr>
+          <w:rFonts w:ascii="Spectral" w:hAnsi="Spectral" w:cs="Spectral" w:hint="eastAsia"/>
+          <w:sz w:val="20"/>
+          <w:szCs w:val="20"/>
+          <w:lang w:eastAsia="ko-KR"/>
+        </w:rPr>
+      </w:pPr>
+      <w:r>
+        <w:rPr>
+          <w:rFonts w:ascii="Spectral" w:eastAsia="Spectral" w:hAnsi="Spectral" w:cs="Spectral"/>
+          <w:b/>
+          <w:sz w:val="20"/>
+          <w:szCs w:val="20"/>
+        </w:rPr>
+        <w:t>Programming Languages:</w:t>
+      </w:r>
+      <w:r>
+        <w:rPr>
+          <w:rFonts w:ascii="Spectral" w:eastAsia="Spectral" w:hAnsi="Spectral" w:cs="Spectral"/>
+          <w:sz w:val="20"/>
+          <w:szCs w:val="20"/>
+        </w:rPr>
+        <w:t xml:space="preserve"> </w:t>
+      </w:r>
+      <w:r>
+        <w:rPr>
+          <w:rFonts w:ascii="Spectral" w:eastAsia="Spectral" w:hAnsi="Spectral" w:cs="Spectral"/>
+          <w:sz w:val="20"/>
+          <w:szCs w:val="20"/>
+        </w:rPr>
+        <w:t>C++, C, Python, GLSL</w:t>
+      </w:r>
+      <w:r>
+        <w:rPr>
+          <w:rFonts w:ascii="Spectral" w:hAnsi="Spectral" w:cs="Spectral"/>
+          <w:sz w:val="20"/>
+          <w:szCs w:val="20"/>
+          <w:lang w:eastAsia="ko-KR"/>
+        </w:rPr>
+        <w:t xml:space="preserve">, </w:t>
+      </w:r>
+      <w:r>
+        <w:rPr>
+          <w:rFonts w:ascii="Spectral" w:eastAsia="Spectral" w:hAnsi="Spectral" w:cs="Spectral"/>
+          <w:sz w:val="20"/>
+          <w:szCs w:val="20"/>
+        </w:rPr>
+        <w:t>C#</w:t>
+      </w:r>
+    </w:p>
+    <w:p>
+      <w:pPr>
+        <w:rPr>
+          <w:rFonts w:ascii="Spectral" w:hAnsi="Spectral" w:cs="Spectral" w:hint="eastAsia"/>
+          <w:bCs/>
+          <w:sz w:val="20"/>
+          <w:szCs w:val="20"/>
+          <w:lang w:eastAsia="ko-KR"/>
+        </w:rPr>
+      </w:pPr>
+      <w:r>
+        <w:rPr>
+          <w:rFonts w:ascii="Spectral" w:hAnsi="Spectral" w:cs="Spectral"/>
+          <w:b/>
+          <w:sz w:val="20"/>
+          <w:szCs w:val="20"/>
+          <w:lang w:eastAsia="ko-KR"/>
+        </w:rPr>
+        <w:t>Frameworks &amp; Libraries</w:t>
+      </w:r>
+      <w:r>
+        <w:rPr>
+          <w:rFonts w:ascii="Spectral" w:eastAsia="Spectral" w:hAnsi="Spectral" w:cs="Spectral"/>
+          <w:b/>
+          <w:sz w:val="20"/>
+          <w:szCs w:val="20"/>
+        </w:rPr>
+        <w:t xml:space="preserve">: </w:t>
+      </w:r>
+      <w:r>
+        <w:rPr>
+          <w:rFonts w:ascii="Spectral" w:eastAsia="Spectral" w:hAnsi="Spectral" w:cs="Spectral"/>
+          <w:bCs/>
+          <w:sz w:val="20"/>
+          <w:szCs w:val="20"/>
+        </w:rPr>
+        <w:t>OpenGL, WebGL, ROS 1/2</w:t>
+      </w:r>
+      <w:r>
+        <w:rPr>
+          <w:rFonts w:ascii="Spectral" w:hAnsi="Spectral" w:cs="Spectral" w:hint="eastAsia"/>
+          <w:bCs/>
+          <w:sz w:val="20"/>
+          <w:szCs w:val="20"/>
+          <w:lang w:eastAsia="ko-KR"/>
+        </w:rPr>
+        <w:t xml:space="preserve">, </w:t>
+      </w:r>
+      <w:r>
+        <w:rPr>
+          <w:rFonts w:ascii="Spectral" w:eastAsia="Spectral" w:hAnsi="Spectral" w:cs="Spectral"/>
+          <w:bCs/>
+          <w:sz w:val="20"/>
+          <w:szCs w:val="20"/>
+        </w:rPr>
+        <w:t>OpenCV, PyTorch, CUDA, Unity</w:t>
+      </w:r>
+    </w:p>
+    <w:p>
+      <w:pPr>
+        <w:rPr>
+          <w:rFonts w:ascii="Spectral" w:hAnsi="Spectral" w:cs="Spectral" w:hint="eastAsia"/>
+          <w:sz w:val="20"/>
+          <w:szCs w:val="20"/>
+          <w:lang w:eastAsia="ko-KR"/>
+        </w:rPr>
+      </w:pPr>
+      <w:r>
+        <w:rPr>
+          <w:rFonts w:ascii="Spectral" w:hAnsi="Spectral" w:cs="Spectral"/>
+          <w:b/>
+          <w:sz w:val="20"/>
+          <w:szCs w:val="20"/>
+          <w:lang w:eastAsia="ko-KR"/>
+        </w:rPr>
+        <w:t>Tools &amp; Systems</w:t>
+      </w:r>
+      <w:r>
+        <w:rPr>
+          <w:rFonts w:ascii="Spectral" w:eastAsia="Spectral" w:hAnsi="Spectral" w:cs="Spectral"/>
+          <w:b/>
+          <w:sz w:val="20"/>
+          <w:szCs w:val="20"/>
+        </w:rPr>
+        <w:t xml:space="preserve">: </w:t>
+      </w:r>
+      <w:r>
+        <w:rPr>
+          <w:rFonts w:ascii="Spectral" w:hAnsi="Spectral" w:cs="Spectral"/>
+          <w:bCs/>
+          <w:sz w:val="20"/>
+          <w:szCs w:val="20"/>
+          <w:lang w:eastAsia="ko-KR"/>
+        </w:rPr>
+        <w:t>Linu</w:t>
+      </w:r>
+      <w:r>
+        <w:rPr>
+          <w:rFonts w:ascii="Spectral" w:hAnsi="Spectral" w:cs="Spectral" w:hint="eastAsia"/>
+          <w:bCs/>
+          <w:sz w:val="20"/>
+          <w:szCs w:val="20"/>
+          <w:lang w:eastAsia="ko-KR"/>
+        </w:rPr>
+        <w:t>x</w:t>
+      </w:r>
+      <w:r>
+        <w:rPr>
+          <w:rFonts w:ascii="Spectral" w:hAnsi="Spectral" w:cs="Spectral"/>
+          <w:bCs/>
+          <w:sz w:val="20"/>
+          <w:szCs w:val="20"/>
+          <w:lang w:eastAsia="ko-KR"/>
+        </w:rPr>
+        <w:t>, CMake, Git/GitHub</w:t>
+      </w:r>
+    </w:p>
+    <w:p>
+      <w:pPr>
+        <w:rPr>
+          <w:rFonts w:ascii="Spectral" w:hAnsi="Spectral" w:cs="Spectral" w:hint="eastAsia"/>
+          <w:sz w:val="20"/>
+          <w:szCs w:val="20"/>
+          <w:lang w:eastAsia="ko-KR"/>
+        </w:rPr>
+      </w:pPr>
+      <w:r>
+        <w:rPr>
+          <w:rFonts w:ascii="Spectral" w:eastAsia="Spectral" w:hAnsi="Spectral" w:cs="Spectral"/>
+          <w:b/>
+          <w:sz w:val="20"/>
+          <w:szCs w:val="20"/>
+        </w:rPr>
+        <w:t>Interpersonal Skills</w:t>
+      </w:r>
+      <w:r>
+        <w:rPr>
+          <w:rFonts w:ascii="Spectral" w:eastAsia="Spectral" w:hAnsi="Spectral" w:cs="Spectral"/>
+          <w:sz w:val="20"/>
+          <w:szCs w:val="20"/>
+        </w:rPr>
+        <w:t xml:space="preserve">: </w:t>
+      </w:r>
+      <w:r>
+        <w:rPr>
+          <w:rFonts w:ascii="Spectral" w:eastAsia="Spectral" w:hAnsi="Spectral" w:cs="Spectral"/>
+          <w:sz w:val="20"/>
+          <w:szCs w:val="20"/>
+        </w:rPr>
+        <w:t>Cross-functional Collaboration, Technical Communication, Problem Solving, Adaptability</w:t>
+      </w:r>
+    </w:p>
+    <w:p>
+      <w:pPr>
+        <w:rPr>
+          <w:rFonts w:ascii="Spectral" w:eastAsia="Spectral" w:hAnsi="Spectral" w:cs="Spectral"/>
+          <w:sz w:val="20"/>
+          <w:szCs w:val="20"/>
+        </w:rPr>
+      </w:pPr>
+    </w:p>
+    <w:p>
+      <w:pPr>
+        <w:pBdr>
+          <w:bottom w:val="single" w:sz="6" w:space="1" w:color="000000"/>
+        </w:pBdr>
+        <w:rPr>
+          <w:rFonts w:ascii="Spectral" w:eastAsia="Spectral" w:hAnsi="Spectral" w:cs="Spectral"/>
+          <w:sz w:val="22"/>
+          <w:szCs w:val="22"/>
+        </w:rPr>
+      </w:pPr>
+      <w:r>
+        <w:rPr>
+          <w:rFonts w:ascii="Spectral" w:hAnsi="Spectral" w:cs="Spectral" w:hint="eastAsia"/>
+          <w:b/>
+          <w:smallCaps/>
+          <w:sz w:val="22"/>
+          <w:szCs w:val="22"/>
+          <w:lang w:eastAsia="ko-KR"/>
+        </w:rPr>
+        <w:t>RESEARCH</w:t>
+      </w:r>
+      <w:r>
+        <w:rPr>
+          <w:rFonts w:ascii="Spectral" w:eastAsia="Spectral" w:hAnsi="Spectral" w:cs="Spectral"/>
+          <w:b/>
+          <w:smallCaps/>
+          <w:sz w:val="22"/>
+          <w:szCs w:val="22"/>
+        </w:rPr>
+        <w:t xml:space="preserve"> EXPERIENCE</w:t>
+      </w:r>
+    </w:p>
+    <w:p>
+      <w:pPr>
+        <w:rPr>
+          <w:rFonts w:ascii="Spectral" w:eastAsia="Spectral" w:hAnsi="Spectral" w:cs="Spectral"/>
+          <w:sz w:val="8"/>
+          <w:szCs w:val="8"/>
+        </w:rPr>
+      </w:pPr>
+    </w:p>
+    <w:p>
+      <w:pPr>
+        <w:tabs>
+          <w:tab w:val="left" w:pos="1134"/>
+          <w:tab w:val="right" w:pos="10503"/>
+        </w:tabs>
+        <w:rPr>
           <w:rFonts w:ascii="Spectral" w:eastAsia="Spectral" w:hAnsi="Spectral" w:cs="Spectral"/>
           <w:sz w:val="22"/>
           <w:szCs w:val="22"/>
@@ -859,21 +1202,11 @@
       </w:pPr>
       <w:r>
         <w:rPr>
-          <w:rFonts w:ascii="Spectral" w:hAnsi="Spectral" w:cs="Spectral" w:hint="eastAsia"/>
-          <w:sz w:val="20"/>
-          <w:szCs w:val="20"/>
-          <w:lang w:eastAsia="ko-KR"/>
-        </w:rPr>
-        <w:t>I</w:t>
-      </w:r>
-      <w:r>
-        <w:rPr>
-          <w:rFonts w:ascii="Spectral" w:hAnsi="Spectral" w:cs="Spectral"/>
-          <w:sz w:val="20"/>
-          <w:szCs w:val="20"/>
-          <w:lang w:eastAsia="ko-KR"/>
-        </w:rPr>
-        <w:t>mplemented an adaptive binarization-based lane detection pipeline using OpenCV for robust lane segmentation under varying lighting conditions.</w:t>
+          <w:rFonts w:ascii="Spectral" w:eastAsia="Spectral" w:hAnsi="Spectral" w:cs="Spectral"/>
+          <w:sz w:val="20"/>
+          <w:szCs w:val="20"/>
+        </w:rPr>
+        <w:t>Developed an adaptive binarization-based lane-detection pipeline to improve robustness under varying lighting conditions and presented the work as a poster at KMMS.</w:t>
       </w:r>
     </w:p>
     <w:p>
@@ -894,7 +1227,16 @@
           <w:sz w:val="20"/>
           <w:szCs w:val="20"/>
         </w:rPr>
-        <w:t>Developed a rotation-robust image matching framework for challenging image pairs with large viewpoint and orientation changes.</w:t>
+        <w:t>Developed a rotation-robust dense correspondence framework for aligning challenging image pairs under large in-plane rotations; journal manuscript currently under review</w:t>
+      </w:r>
+      <w:r>
+        <w:rPr>
+          <w:rFonts w:ascii="Spectral" w:hAnsi="Spectral" w:cs="Spectral" w:hint="eastAsia"/>
+          <w:sz w:val="20"/>
+          <w:szCs w:val="20"/>
+          <w:lang w:eastAsia="ko-KR"/>
+        </w:rPr>
+        <w:t>.</w:t>
       </w:r>
     </w:p>
     <w:p>
@@ -915,7 +1257,7 @@
           <w:sz w:val="20"/>
           <w:szCs w:val="20"/>
         </w:rPr>
-        <w:t>Conducted literature reviews, failure-case analysis, and reproducible experiments while developing research communication and documentation skills</w:t>
+        <w:t>Designed and conducted reproducible experiments, including baseline comparisons, ablation studies, and failure-case analysis, and documented results for publication</w:t>
       </w:r>
       <w:r>
         <w:rPr>
@@ -956,15 +1298,6 @@
         </w:rPr>
         <w:t>PROJECTS</w:t>
       </w:r>
-    </w:p>
-    <w:p>
-      <w:pPr>
-        <w:rPr>
-          <w:rFonts w:ascii="Spectral" w:eastAsia="Spectral" w:hAnsi="Spectral" w:cs="Spectral"/>
-          <w:sz w:val="8"/>
-          <w:szCs w:val="8"/>
-        </w:rPr>
-      </w:pPr>
     </w:p>
     <w:p>
       <w:pPr>
@@ -973,9 +1306,10 @@
           <w:tab w:val="right" w:pos="10503"/>
         </w:tabs>
         <w:rPr>
-          <w:rFonts w:ascii="Spectral" w:eastAsia="Spectral" w:hAnsi="Spectral" w:cs="Spectral"/>
-          <w:sz w:val="22"/>
-          <w:szCs w:val="22"/>
+          <w:rFonts w:ascii="Spectral" w:hAnsi="Spectral" w:cs="Spectral" w:hint="eastAsia"/>
+          <w:sz w:val="22"/>
+          <w:szCs w:val="22"/>
+          <w:lang w:eastAsia="ko-KR"/>
         </w:rPr>
       </w:pPr>
       <w:r>
@@ -987,7 +1321,7 @@
           <w:szCs w:val="23"/>
           <w:lang w:eastAsia="ko-KR"/>
         </w:rPr>
-        <w:t>Stand-By</w:t>
+        <w:t>Manzo</w:t>
       </w:r>
       <w:r>
         <w:rPr>
@@ -1027,47 +1361,46 @@
           <w:szCs w:val="20"/>
         </w:rPr>
         <w:tab/>
-        <w:t xml:space="preserve">  </w:t>
-      </w:r>
-      <w:r>
-        <w:rPr>
-          <w:rFonts w:ascii="Spectral" w:eastAsia="Spectral" w:hAnsi="Spectral" w:cs="Spectral"/>
-          <w:b/>
-          <w:sz w:val="22"/>
-          <w:szCs w:val="22"/>
-        </w:rPr>
-        <w:t xml:space="preserve">Mar 2024 </w:t>
-      </w:r>
-      <w:bookmarkStart w:id="0" w:name="_Hlk231236121"/>
-      <w:r>
-        <w:rPr>
-          <w:rFonts w:ascii="Spectral" w:eastAsia="Spectral" w:hAnsi="Spectral" w:cs="Spectral"/>
-          <w:b/>
-          <w:sz w:val="22"/>
-          <w:szCs w:val="22"/>
-        </w:rPr>
-        <w:t xml:space="preserve">– </w:t>
-      </w:r>
-      <w:r>
-        <w:rPr>
-          <w:rFonts w:ascii="Spectral" w:hAnsi="Spectral" w:cs="Spectral" w:hint="eastAsia"/>
-          <w:b/>
-          <w:sz w:val="22"/>
-          <w:szCs w:val="22"/>
-          <w:lang w:eastAsia="ko-KR"/>
-        </w:rPr>
-        <w:t>J</w:t>
-      </w:r>
-      <w:r>
-        <w:rPr>
-          <w:rFonts w:ascii="Spectral" w:eastAsia="Spectral" w:hAnsi="Spectral" w:cs="Spectral"/>
-          <w:b/>
-          <w:sz w:val="22"/>
-          <w:szCs w:val="22"/>
-        </w:rPr>
-        <w:t>un 2024</w:t>
-      </w:r>
-      <w:bookmarkEnd w:id="0"/>
+        <w:t xml:space="preserve"> Jul</w:t>
+      </w:r>
+      <w:r>
+        <w:rPr>
+          <w:rFonts w:ascii="Spectral" w:eastAsia="Spectral" w:hAnsi="Spectral" w:cs="Spectral"/>
+          <w:b/>
+          <w:sz w:val="22"/>
+          <w:szCs w:val="22"/>
+        </w:rPr>
+        <w:t xml:space="preserve"> 2024 – </w:t>
+      </w:r>
+      <w:r>
+        <w:rPr>
+          <w:rFonts w:ascii="Spectral" w:hAnsi="Spectral" w:cs="Spectral" w:hint="eastAsia"/>
+          <w:b/>
+          <w:sz w:val="22"/>
+          <w:szCs w:val="22"/>
+          <w:lang w:eastAsia="ko-KR"/>
+        </w:rPr>
+        <w:t>Jun</w:t>
+      </w:r>
+      <w:r>
+        <w:rPr>
+          <w:rFonts w:ascii="Spectral" w:eastAsia="Spectral" w:hAnsi="Spectral" w:cs="Spectral"/>
+          <w:b/>
+          <w:sz w:val="22"/>
+          <w:szCs w:val="22"/>
+        </w:rPr>
+        <w:t xml:space="preserve"> 202</w:t>
+      </w:r>
+      <w:r>
+        <w:rPr>
+          <w:rFonts w:ascii="Spectral" w:hAnsi="Spectral" w:cs="Spectral" w:hint="eastAsia"/>
+          <w:b/>
+          <w:sz w:val="22"/>
+          <w:szCs w:val="22"/>
+          <w:lang w:eastAsia="ko-KR"/>
+        </w:rPr>
+        <w:t>5</w:t>
+      </w:r>
     </w:p>
     <w:p>
       <w:pPr>
@@ -1087,26 +1420,7 @@
           <w:sz w:val="20"/>
           <w:szCs w:val="20"/>
         </w:rPr>
-        <w:t xml:space="preserve">Collaborated with a team of </w:t>
-      </w:r>
-      <w:r>
-        <w:rPr>
-          <w:rFonts w:ascii="Spectral" w:hAnsi="Spectral" w:cs="Spectral" w:hint="eastAsia"/>
-          <w:b/>
-          <w:bCs/>
-          <w:sz w:val="20"/>
-          <w:szCs w:val="20"/>
-          <w:lang w:eastAsia="ko-KR"/>
-        </w:rPr>
-        <w:t>4</w:t>
-      </w:r>
-      <w:r>
-        <w:rPr>
-          <w:rFonts w:ascii="Spectral" w:eastAsia="Spectral" w:hAnsi="Spectral" w:cs="Spectral"/>
-          <w:sz w:val="20"/>
-          <w:szCs w:val="20"/>
-        </w:rPr>
-        <w:t xml:space="preserve"> members to implement core gameplay systems, including order processing, scoring logic, customer interactions, and game flow.</w:t>
+        <w:t>Led technical development of a rhythm-based horror adventure game built with a custom C++ / OpenGL game engine.</w:t>
       </w:r>
     </w:p>
     <w:p>
@@ -1127,47 +1441,46 @@
           <w:sz w:val="20"/>
           <w:szCs w:val="20"/>
         </w:rPr>
-        <w:t>Managed code integration, build testing, debugging, and milestone delivery throughout the development cycle.</w:t>
-      </w:r>
-    </w:p>
-    <w:p>
-      <w:pPr>
-        <w:pStyle w:val="a5"/>
+        <w:t>Implemented core rendering features, including vector-font rendering, shader-based underwater visibility effects, and UI support for quest windows and icons.</w:t>
+      </w:r>
+    </w:p>
+    <w:p>
+      <w:pPr>
         <w:numPr>
           <w:ilvl w:val="0"/>
           <w:numId w:val="1"/>
         </w:numPr>
-        <w:ind w:leftChars="0"/>
-        <w:rPr>
-          <w:rFonts w:ascii="Spectral" w:eastAsia="Spectral" w:hAnsi="Spectral" w:cs="Spectral"/>
-          <w:sz w:val="20"/>
-          <w:szCs w:val="20"/>
-        </w:rPr>
-      </w:pPr>
-      <w:r>
-        <w:rPr>
-          <w:rFonts w:ascii="Spectral" w:eastAsia="Spectral" w:hAnsi="Spectral" w:cs="Spectral"/>
-          <w:sz w:val="20"/>
-          <w:szCs w:val="20"/>
-        </w:rPr>
-        <w:t xml:space="preserve">Received the Best Project Award at the </w:t>
-      </w:r>
-      <w:r>
-        <w:rPr>
-          <w:rFonts w:ascii="Spectral" w:hAnsi="Spectral" w:cs="Spectral" w:hint="eastAsia"/>
-          <w:sz w:val="20"/>
-          <w:szCs w:val="20"/>
-          <w:lang w:eastAsia="ko-KR"/>
-        </w:rPr>
-        <w:t>Keimyung University</w:t>
-      </w:r>
-      <w:r>
-        <w:rPr>
-          <w:rFonts w:ascii="Spectral" w:eastAsia="Spectral" w:hAnsi="Spectral" w:cs="Spectral"/>
-          <w:sz w:val="20"/>
-          <w:szCs w:val="20"/>
-        </w:rPr>
-        <w:t xml:space="preserve"> Micro-Degree Expo. </w:t>
+        <w:rPr>
+          <w:rFonts w:ascii="Spectral" w:eastAsia="Spectral" w:hAnsi="Spectral" w:cs="Spectral"/>
+          <w:sz w:val="20"/>
+          <w:szCs w:val="20"/>
+        </w:rPr>
+      </w:pPr>
+      <w:r>
+        <w:rPr>
+          <w:rFonts w:ascii="Spectral" w:hAnsi="Spectral" w:cs="Spectral"/>
+          <w:sz w:val="20"/>
+          <w:szCs w:val="20"/>
+          <w:lang w:eastAsia="ko-KR"/>
+        </w:rPr>
+        <w:t>Developed autonomous fish behaviors using pathfinding, terrain avoidance, flocking, and quadtree-based spatial partitioning</w:t>
+      </w:r>
+      <w:r>
+        <w:rPr>
+          <w:rFonts w:ascii="Spectral" w:hAnsi="Spectral" w:cs="Spectral" w:hint="eastAsia"/>
+          <w:sz w:val="20"/>
+          <w:szCs w:val="20"/>
+          <w:lang w:eastAsia="ko-KR"/>
+        </w:rPr>
+        <w:t>.</w:t>
+      </w:r>
+      <w:r>
+        <w:rPr>
+          <w:rFonts w:ascii="Spectral" w:eastAsia="Spectral" w:hAnsi="Spectral" w:cs="Spectral"/>
+          <w:sz w:val="20"/>
+          <w:szCs w:val="20"/>
+        </w:rPr>
+        <w:t xml:space="preserve"> </w:t>
       </w:r>
     </w:p>
     <w:p>
@@ -1177,10 +1490,9 @@
           <w:tab w:val="right" w:pos="10503"/>
         </w:tabs>
         <w:rPr>
-          <w:rFonts w:ascii="Spectral" w:hAnsi="Spectral" w:cs="Spectral" w:hint="eastAsia"/>
-          <w:sz w:val="22"/>
-          <w:szCs w:val="22"/>
-          <w:lang w:eastAsia="ko-KR"/>
+          <w:rFonts w:ascii="Spectral" w:eastAsia="Spectral" w:hAnsi="Spectral" w:cs="Spectral"/>
+          <w:sz w:val="22"/>
+          <w:szCs w:val="22"/>
         </w:rPr>
       </w:pPr>
       <w:r>
@@ -1192,85 +1504,121 @@
           <w:szCs w:val="23"/>
           <w:lang w:eastAsia="ko-KR"/>
         </w:rPr>
-        <w:t>Manzo</w:t>
-      </w:r>
-      <w:r>
-        <w:rPr>
-          <w:rFonts w:ascii="Spectral" w:eastAsia="Spectral" w:hAnsi="Spectral" w:cs="Spectral"/>
+        <w:t xml:space="preserve">KAIST </w:t>
+      </w:r>
+      <w:r>
+        <w:rPr>
+          <w:rFonts w:ascii="Spectral" w:hAnsi="Spectral" w:cs="Spectral"/>
           <w:b/>
           <w:smallCaps/>
           <w:sz w:val="23"/>
           <w:szCs w:val="23"/>
-        </w:rPr>
-        <w:t xml:space="preserve"> | </w:t>
-      </w:r>
-      <w:r>
-        <w:rPr>
-          <w:rFonts w:ascii="Spectral" w:hAnsi="Spectral" w:cs="Spectral" w:hint="eastAsia"/>
-          <w:b/>
-          <w:sz w:val="22"/>
-          <w:szCs w:val="22"/>
-          <w:lang w:eastAsia="ko-KR"/>
-        </w:rPr>
-        <w:t>Technical Leader</w:t>
-      </w:r>
-      <w:r>
-        <w:rPr>
-          <w:rFonts w:ascii="Spectral" w:eastAsia="Spectral" w:hAnsi="Spectral" w:cs="Spectral"/>
-          <w:b/>
-          <w:sz w:val="22"/>
-          <w:szCs w:val="22"/>
-        </w:rPr>
-        <w:t xml:space="preserve">                                                                                      </w:t>
-      </w:r>
-      <w:r>
-        <w:rPr>
-          <w:rFonts w:ascii="Spectral" w:eastAsia="Spectral" w:hAnsi="Spectral" w:cs="Spectral"/>
+          <w:lang w:eastAsia="ko-KR"/>
+        </w:rPr>
+        <w:t>Mobility</w:t>
+      </w:r>
+      <w:r>
+        <w:rPr>
+          <w:rFonts w:ascii="Spectral" w:hAnsi="Spectral" w:cs="Spectral" w:hint="eastAsia"/>
           <w:b/>
           <w:smallCaps/>
+          <w:sz w:val="23"/>
+          <w:szCs w:val="23"/>
+          <w:lang w:eastAsia="ko-KR"/>
+        </w:rPr>
+        <w:t xml:space="preserve"> Challenge</w:t>
+      </w:r>
+      <w:r>
+        <w:rPr>
+          <w:rFonts w:ascii="Spectral" w:eastAsia="Spectral" w:hAnsi="Spectral" w:cs="Spectral"/>
+          <w:b/>
+          <w:smallCaps/>
+          <w:sz w:val="23"/>
+          <w:szCs w:val="23"/>
+        </w:rPr>
+        <w:t xml:space="preserve"> </w:t>
+      </w:r>
+      <w:r>
+        <w:rPr>
+          <w:rFonts w:ascii="Spectral" w:hAnsi="Spectral" w:cs="Spectral" w:hint="eastAsia"/>
+          <w:b/>
+          <w:smallCaps/>
+          <w:sz w:val="23"/>
+          <w:szCs w:val="23"/>
+          <w:lang w:eastAsia="ko-KR"/>
+        </w:rPr>
+        <w:t xml:space="preserve">Competition </w:t>
+      </w:r>
+      <w:r>
+        <w:rPr>
+          <w:rFonts w:ascii="Spectral" w:eastAsia="Spectral" w:hAnsi="Spectral" w:cs="Spectral"/>
+          <w:b/>
+          <w:smallCaps/>
+          <w:sz w:val="23"/>
+          <w:szCs w:val="23"/>
+        </w:rPr>
+        <w:t xml:space="preserve">| </w:t>
+      </w:r>
+      <w:r>
+        <w:rPr>
+          <w:rFonts w:ascii="Spectral" w:eastAsia="Spectral" w:hAnsi="Spectral" w:cs="Spectral"/>
+          <w:b/>
+          <w:smallCaps/>
+          <w:sz w:val="23"/>
+          <w:szCs w:val="23"/>
+        </w:rPr>
+        <w:t xml:space="preserve">Autonomous </w:t>
+      </w:r>
+      <w:r>
+        <w:rPr>
+          <w:rFonts w:ascii="Spectral" w:hAnsi="Spectral" w:cs="Spectral" w:hint="eastAsia"/>
+          <w:b/>
+          <w:smallCaps/>
+          <w:sz w:val="23"/>
+          <w:szCs w:val="23"/>
+          <w:lang w:eastAsia="ko-KR"/>
+        </w:rPr>
+        <w:t>Systems</w:t>
+      </w:r>
+      <w:r>
+        <w:rPr>
+          <w:rFonts w:ascii="Spectral" w:eastAsia="Spectral" w:hAnsi="Spectral" w:cs="Spectral"/>
+          <w:b/>
+          <w:smallCaps/>
+          <w:sz w:val="23"/>
+          <w:szCs w:val="23"/>
+        </w:rPr>
+        <w:t xml:space="preserve"> Software Engineer</w:t>
+      </w:r>
+      <w:r>
+        <w:rPr>
+          <w:rFonts w:ascii="Spectral" w:eastAsia="Spectral" w:hAnsi="Spectral" w:cs="Spectral"/>
+          <w:b/>
+          <w:smallCaps/>
           <w:sz w:val="20"/>
           <w:szCs w:val="20"/>
         </w:rPr>
         <w:tab/>
-        <w:t xml:space="preserve">  </w:t>
-      </w:r>
-      <w:r>
-        <w:rPr>
-          <w:rFonts w:ascii="Spectral" w:hAnsi="Spectral" w:cs="Spectral" w:hint="eastAsia"/>
-          <w:b/>
-          <w:sz w:val="22"/>
-          <w:szCs w:val="22"/>
-          <w:lang w:eastAsia="ko-KR"/>
-        </w:rPr>
-        <w:t>Jul</w:t>
-      </w:r>
-      <w:r>
-        <w:rPr>
-          <w:rFonts w:ascii="Spectral" w:eastAsia="Spectral" w:hAnsi="Spectral" w:cs="Spectral"/>
-          <w:b/>
-          <w:sz w:val="22"/>
-          <w:szCs w:val="22"/>
-        </w:rPr>
-        <w:t xml:space="preserve"> 2024 – </w:t>
-      </w:r>
-      <w:r>
-        <w:rPr>
-          <w:rFonts w:ascii="Spectral" w:hAnsi="Spectral" w:cs="Spectral" w:hint="eastAsia"/>
-          <w:b/>
-          <w:sz w:val="22"/>
-          <w:szCs w:val="22"/>
-          <w:lang w:eastAsia="ko-KR"/>
-        </w:rPr>
-        <w:t>Jun</w:t>
-      </w:r>
-      <w:r>
-        <w:rPr>
-          <w:rFonts w:ascii="Spectral" w:eastAsia="Spectral" w:hAnsi="Spectral" w:cs="Spectral"/>
-          <w:b/>
-          <w:sz w:val="22"/>
-          <w:szCs w:val="22"/>
-        </w:rPr>
-        <w:t xml:space="preserve"> 202</w:t>
+        <w:t xml:space="preserve"> Dec</w:t>
+      </w:r>
+      <w:r>
+        <w:rPr>
+          <w:rFonts w:ascii="Spectral" w:hAnsi="Spectral" w:cs="Spectral" w:hint="eastAsia"/>
+          <w:b/>
+          <w:sz w:val="22"/>
+          <w:szCs w:val="22"/>
+          <w:lang w:eastAsia="ko-KR"/>
+        </w:rPr>
+        <w:t xml:space="preserve"> </w:t>
+      </w:r>
+      <w:r>
+        <w:rPr>
+          <w:rFonts w:ascii="Spectral" w:eastAsia="Spectral" w:hAnsi="Spectral" w:cs="Spectral"/>
+          <w:b/>
+          <w:sz w:val="22"/>
+          <w:szCs w:val="22"/>
+        </w:rPr>
+        <w:t>202</w:t>
       </w:r>
       <w:r>
         <w:rPr>
@@ -1281,6 +1629,25 @@
           <w:lang w:eastAsia="ko-KR"/>
         </w:rPr>
         <w:t>5</w:t>
+      </w:r>
+      <w:r>
+        <w:rPr>
+          <w:rFonts w:ascii="Spectral" w:eastAsia="Spectral" w:hAnsi="Spectral" w:cs="Spectral"/>
+          <w:b/>
+          <w:sz w:val="22"/>
+          <w:szCs w:val="22"/>
+        </w:rPr>
+        <w:t xml:space="preserve"> –</w:t>
+      </w:r>
+      <w:r>
+        <w:rPr>
+          <w:rFonts w:ascii="Spectral" w:hAnsi="Spectral" w:cs="Spectral" w:hint="eastAsia"/>
+          <w:b/>
+          <w:sz w:val="22"/>
+          <w:szCs w:val="22"/>
+          <w:lang w:eastAsia="ko-KR"/>
+        </w:rPr>
+        <w:t xml:space="preserve"> Feb 2026</w:t>
       </w:r>
     </w:p>
     <w:p>
@@ -1293,15 +1660,46 @@
           <w:rFonts w:ascii="Spectral" w:eastAsia="Spectral" w:hAnsi="Spectral" w:cs="Spectral"/>
           <w:sz w:val="20"/>
           <w:szCs w:val="20"/>
-        </w:rPr>
-      </w:pPr>
-      <w:r>
-        <w:rPr>
-          <w:rFonts w:ascii="Spectral" w:eastAsia="Spectral" w:hAnsi="Spectral" w:cs="Spectral"/>
-          <w:sz w:val="20"/>
-          <w:szCs w:val="20"/>
-        </w:rPr>
-        <w:t>Led technical development of a rhythm-based horror adventure game built with a custom C++ / OpenGL game engine.</w:t>
+          <w:lang w:eastAsia="ko-KR"/>
+        </w:rPr>
+      </w:pPr>
+      <w:r>
+        <w:rPr>
+          <w:rFonts w:ascii="Spectral" w:eastAsia="Spectral" w:hAnsi="Spectral" w:cs="Spectral"/>
+          <w:sz w:val="20"/>
+          <w:szCs w:val="20"/>
+          <w:lang w:eastAsia="ko-KR"/>
+        </w:rPr>
+        <w:t xml:space="preserve">Won the </w:t>
+      </w:r>
+      <w:r>
+        <w:rPr>
+          <w:rFonts w:ascii="Spectral" w:eastAsia="Spectral" w:hAnsi="Spectral" w:cs="Spectral"/>
+          <w:b/>
+          <w:bCs/>
+          <w:sz w:val="20"/>
+          <w:szCs w:val="20"/>
+          <w:lang w:eastAsia="ko-KR"/>
+        </w:rPr>
+        <w:t>Excellence Award, placing 3rd overall</w:t>
+      </w:r>
+      <w:r>
+        <w:rPr>
+          <w:rFonts w:ascii="Spectral" w:eastAsia="Spectral" w:hAnsi="Spectral" w:cs="Spectral"/>
+          <w:sz w:val="20"/>
+          <w:szCs w:val="20"/>
+          <w:lang w:eastAsia="ko-KR"/>
+        </w:rPr>
+        <w:t>, for developing a V2X-based cooperative autonomous driving system.</w:t>
+      </w:r>
+      <w:r>
+        <w:rPr>
+          <w:rFonts w:ascii="Spectral" w:eastAsia="Spectral" w:hAnsi="Spectral" w:cs="Spectral"/>
+          <w:sz w:val="20"/>
+          <w:szCs w:val="20"/>
+          <w:lang w:eastAsia="ko-KR"/>
+        </w:rPr>
+        <w:t xml:space="preserve"> </w:t>
       </w:r>
     </w:p>
     <w:p>
@@ -1314,15 +1712,37 @@
           <w:rFonts w:ascii="Spectral" w:eastAsia="Spectral" w:hAnsi="Spectral" w:cs="Spectral"/>
           <w:sz w:val="20"/>
           <w:szCs w:val="20"/>
-        </w:rPr>
-      </w:pPr>
-      <w:r>
-        <w:rPr>
-          <w:rFonts w:ascii="Spectral" w:eastAsia="Spectral" w:hAnsi="Spectral" w:cs="Spectral"/>
-          <w:sz w:val="20"/>
-          <w:szCs w:val="20"/>
-        </w:rPr>
-        <w:t>Implemented a custom vector-font rendering system using OpenGL vertex and fragment shaders for in-game text and UI rendering.</w:t>
+          <w:lang w:eastAsia="ko-KR"/>
+        </w:rPr>
+      </w:pPr>
+      <w:r>
+        <w:rPr>
+          <w:rFonts w:ascii="Spectral" w:eastAsia="Spectral" w:hAnsi="Spectral" w:cs="Spectral"/>
+          <w:sz w:val="20"/>
+          <w:szCs w:val="20"/>
+          <w:lang w:eastAsia="ko-KR"/>
+        </w:rPr>
+        <w:t xml:space="preserve">Developed a cooperative decision-making and control pipeline coordinating </w:t>
+      </w:r>
+      <w:r>
+        <w:rPr>
+          <w:rFonts w:ascii="Spectral" w:eastAsia="Spectral" w:hAnsi="Spectral" w:cs="Spectral"/>
+          <w:b/>
+          <w:bCs/>
+          <w:sz w:val="20"/>
+          <w:szCs w:val="20"/>
+          <w:lang w:eastAsia="ko-KR"/>
+        </w:rPr>
+        <w:t>four autonomous vehicles</w:t>
+      </w:r>
+      <w:r>
+        <w:rPr>
+          <w:rFonts w:ascii="Spectral" w:eastAsia="Spectral" w:hAnsi="Spectral" w:cs="Spectral"/>
+          <w:sz w:val="20"/>
+          <w:szCs w:val="20"/>
+          <w:lang w:eastAsia="ko-KR"/>
+        </w:rPr>
+        <w:t xml:space="preserve"> across roundabout entry and exit and four-way intersection scenarios.</w:t>
       </w:r>
     </w:p>
     <w:p>
@@ -1335,24 +1755,57 @@
           <w:rFonts w:ascii="Spectral" w:eastAsia="Spectral" w:hAnsi="Spectral" w:cs="Spectral"/>
           <w:sz w:val="20"/>
           <w:szCs w:val="20"/>
-        </w:rPr>
-      </w:pPr>
-      <w:r>
-        <w:rPr>
-          <w:rFonts w:ascii="Spectral" w:eastAsia="Spectral" w:hAnsi="Spectral" w:cs="Spectral"/>
-          <w:sz w:val="20"/>
-          <w:szCs w:val="20"/>
-        </w:rPr>
-        <w:t>Implemented AI behaviors such as flocking, obstacle avoidance, and autonomous agent movement while maintaining build stability across milestones</w:t>
-      </w:r>
-      <w:r>
-        <w:rPr>
-          <w:rFonts w:ascii="Spectral" w:hAnsi="Spectral" w:cs="Spectral" w:hint="eastAsia"/>
-          <w:sz w:val="20"/>
-          <w:szCs w:val="20"/>
-          <w:lang w:eastAsia="ko-KR"/>
-        </w:rPr>
-        <w:t>.</w:t>
+          <w:lang w:eastAsia="ko-KR"/>
+        </w:rPr>
+      </w:pPr>
+      <w:r>
+        <w:rPr>
+          <w:rFonts w:ascii="Spectral" w:eastAsia="Spectral" w:hAnsi="Spectral" w:cs="Spectral"/>
+          <w:sz w:val="20"/>
+          <w:szCs w:val="20"/>
+          <w:lang w:eastAsia="ko-KR"/>
+        </w:rPr>
+        <w:t xml:space="preserve">Implemented stop-or-go </w:t>
+      </w:r>
+      <w:r>
+        <w:rPr>
+          <w:rFonts w:ascii="Spectral" w:eastAsia="Spectral" w:hAnsi="Spectral" w:cs="Spectral"/>
+          <w:b/>
+          <w:bCs/>
+          <w:sz w:val="20"/>
+          <w:szCs w:val="20"/>
+          <w:lang w:eastAsia="ko-KR"/>
+        </w:rPr>
+        <w:t>collision-avoidance logic and</w:t>
+      </w:r>
+      <w:r>
+        <w:rPr>
+          <w:rFonts w:ascii="Spectral" w:eastAsia="Spectral" w:hAnsi="Spectral" w:cs="Spectral"/>
+          <w:sz w:val="20"/>
+          <w:szCs w:val="20"/>
+          <w:lang w:eastAsia="ko-KR"/>
+        </w:rPr>
+        <w:t xml:space="preserve"> an </w:t>
+      </w:r>
+      <w:r>
+        <w:rPr>
+          <w:rFonts w:ascii="Spectral" w:eastAsia="Spectral" w:hAnsi="Spectral" w:cs="Spectral"/>
+          <w:b/>
+          <w:bCs/>
+          <w:sz w:val="20"/>
+          <w:szCs w:val="20"/>
+          <w:lang w:eastAsia="ko-KR"/>
+        </w:rPr>
+        <w:t>MPC-inspired Pure Pursuit path-tracking</w:t>
+      </w:r>
+      <w:r>
+        <w:rPr>
+          <w:rFonts w:ascii="Spectral" w:eastAsia="Spectral" w:hAnsi="Spectral" w:cs="Spectral"/>
+          <w:sz w:val="20"/>
+          <w:szCs w:val="20"/>
+          <w:lang w:eastAsia="ko-KR"/>
+        </w:rPr>
+        <w:t xml:space="preserve"> controller using ROS2, C++, and Python.</w:t>
       </w:r>
     </w:p>
     <w:p>
@@ -1362,10 +1815,9 @@
           <w:tab w:val="right" w:pos="10503"/>
         </w:tabs>
         <w:rPr>
-          <w:rFonts w:ascii="Spectral" w:hAnsi="Spectral" w:cs="Spectral" w:hint="eastAsia"/>
-          <w:sz w:val="22"/>
-          <w:szCs w:val="22"/>
-          <w:lang w:eastAsia="ko-KR"/>
+          <w:rFonts w:ascii="Spectral" w:eastAsia="Spectral" w:hAnsi="Spectral" w:cs="Spectral"/>
+          <w:sz w:val="22"/>
+          <w:szCs w:val="22"/>
         </w:rPr>
       </w:pPr>
       <w:r>
@@ -1377,7 +1829,7 @@
           <w:szCs w:val="23"/>
           <w:lang w:eastAsia="ko-KR"/>
         </w:rPr>
-        <w:t>Creativity Mobility Competition</w:t>
+        <w:t>SEA:ME Hackathon</w:t>
       </w:r>
       <w:r>
         <w:rPr>
@@ -1408,7 +1860,7 @@
           <w:szCs w:val="22"/>
           <w:lang w:eastAsia="ko-KR"/>
         </w:rPr>
-        <w:t>Computer Vision Team Leader</w:t>
+        <w:t>Technical Leader</w:t>
       </w:r>
       <w:r>
         <w:rPr>
@@ -1419,55 +1871,17 @@
           <w:szCs w:val="20"/>
         </w:rPr>
         <w:tab/>
-        <w:t xml:space="preserve">  </w:t>
-      </w:r>
-      <w:r>
-        <w:rPr>
-          <w:rFonts w:ascii="Spectral" w:hAnsi="Spectral" w:cs="Spectral" w:hint="eastAsia"/>
-          <w:b/>
-          <w:sz w:val="22"/>
-          <w:szCs w:val="22"/>
-          <w:lang w:eastAsia="ko-KR"/>
-        </w:rPr>
-        <w:t xml:space="preserve">Aug </w:t>
-      </w:r>
-      <w:r>
-        <w:rPr>
-          <w:rFonts w:ascii="Spectral" w:eastAsia="Spectral" w:hAnsi="Spectral" w:cs="Spectral"/>
-          <w:b/>
-          <w:sz w:val="22"/>
-          <w:szCs w:val="22"/>
-        </w:rPr>
-        <w:t>202</w:t>
-      </w:r>
-      <w:r>
-        <w:rPr>
-          <w:rFonts w:ascii="Spectral" w:hAnsi="Spectral" w:cs="Spectral" w:hint="eastAsia"/>
-          <w:b/>
-          <w:sz w:val="22"/>
-          <w:szCs w:val="22"/>
-          <w:lang w:eastAsia="ko-KR"/>
-        </w:rPr>
-        <w:t>5</w:t>
-      </w:r>
-      <w:r>
-        <w:rPr>
-          <w:rFonts w:ascii="Spectral" w:eastAsia="Spectral" w:hAnsi="Spectral" w:cs="Spectral"/>
-          <w:b/>
-          <w:sz w:val="22"/>
-          <w:szCs w:val="22"/>
-        </w:rPr>
-        <w:t xml:space="preserve"> –</w:t>
-      </w:r>
-      <w:r>
-        <w:rPr>
-          <w:rFonts w:ascii="Spectral" w:hAnsi="Spectral" w:cs="Spectral" w:hint="eastAsia"/>
-          <w:b/>
-          <w:sz w:val="22"/>
-          <w:szCs w:val="22"/>
-          <w:lang w:eastAsia="ko-KR"/>
-        </w:rPr>
-        <w:t xml:space="preserve"> Oct 2025</w:t>
+        <w:t xml:space="preserve"> Jul</w:t>
+      </w:r>
+      <w:r>
+        <w:rPr>
+          <w:rFonts w:ascii="Spectral" w:hAnsi="Spectral" w:cs="Spectral" w:hint="eastAsia"/>
+          <w:b/>
+          <w:sz w:val="22"/>
+          <w:szCs w:val="22"/>
+          <w:lang w:eastAsia="ko-KR"/>
+        </w:rPr>
+        <w:t xml:space="preserve"> 2026</w:t>
       </w:r>
     </w:p>
     <w:p>
@@ -1488,15 +1902,25 @@
           <w:sz w:val="20"/>
           <w:szCs w:val="20"/>
         </w:rPr>
-        <w:t>Represented the computer vision team in a mobility competition focused on autonomous perception and intelligent vehicle systems.</w:t>
-      </w:r>
-      <w:r>
-        <w:rPr>
-          <w:rFonts w:ascii="Spectral" w:eastAsia="Spectral" w:hAnsi="Spectral" w:cs="Spectral"/>
-          <w:sz w:val="20"/>
-          <w:szCs w:val="20"/>
-        </w:rPr>
-        <w:t xml:space="preserve"> </w:t>
+        <w:t xml:space="preserve">Led the team to win the </w:t>
+      </w:r>
+      <w:r>
+        <w:rPr>
+          <w:rFonts w:ascii="Spectral" w:eastAsia="Spectral" w:hAnsi="Spectral" w:cs="Spectral"/>
+          <w:b/>
+          <w:bCs/>
+          <w:sz w:val="20"/>
+          <w:szCs w:val="20"/>
+        </w:rPr>
+        <w:t>Silver Award, placing 4th overall with a 56-second finish, only 0.03 seconds behind 3rd place</w:t>
+      </w:r>
+      <w:r>
+        <w:rPr>
+          <w:rFonts w:ascii="Spectral" w:eastAsia="Spectral" w:hAnsi="Spectral" w:cs="Spectral"/>
+          <w:sz w:val="20"/>
+          <w:szCs w:val="20"/>
+        </w:rPr>
+        <w:t>.</w:t>
       </w:r>
     </w:p>
     <w:p>
@@ -1513,11 +1937,30 @@
       </w:pPr>
       <w:r>
         <w:rPr>
-          <w:rFonts w:ascii="Spectral" w:eastAsia="Spectral" w:hAnsi="Spectral" w:cs="Spectral"/>
-          <w:sz w:val="20"/>
-          <w:szCs w:val="20"/>
-        </w:rPr>
-        <w:t>Developed computer vision modules for visual perception tasks such as object detection, scene understanding, and navigation support.</w:t>
+          <w:rFonts w:ascii="Spectral" w:hAnsi="Spectral" w:cs="Spectral"/>
+          <w:sz w:val="20"/>
+          <w:szCs w:val="20"/>
+          <w:lang w:eastAsia="ko-KR"/>
+        </w:rPr>
+        <w:t xml:space="preserve">Led the development and integration of a </w:t>
+      </w:r>
+      <w:r>
+        <w:rPr>
+          <w:rFonts w:ascii="Spectral" w:hAnsi="Spectral" w:cs="Spectral"/>
+          <w:sz w:val="20"/>
+          <w:szCs w:val="20"/>
+          <w:lang w:eastAsia="ko-KR"/>
+        </w:rPr>
+        <w:t>ROS2-based autonomous driving system</w:t>
+      </w:r>
+      <w:r>
+        <w:rPr>
+          <w:rFonts w:ascii="Spectral" w:hAnsi="Spectral" w:cs="Spectral"/>
+          <w:sz w:val="20"/>
+          <w:szCs w:val="20"/>
+          <w:lang w:eastAsia="ko-KR"/>
+        </w:rPr>
+        <w:t xml:space="preserve"> combining camera perception, mission-state management, vehicle control, debugging visualization, and hardware interfaces.</w:t>
       </w:r>
     </w:p>
     <w:p>
@@ -1538,7 +1981,36 @@
           <w:sz w:val="20"/>
           <w:szCs w:val="20"/>
         </w:rPr>
-        <w:t>Coordinated integration between the computer vision, hardware, and control teams to support system-level testing.</w:t>
+        <w:t xml:space="preserve">Developed real-time perception and control algorithms for </w:t>
+      </w:r>
+      <w:r>
+        <w:rPr>
+          <w:rFonts w:ascii="Spectral" w:eastAsia="Spectral" w:hAnsi="Spectral" w:cs="Spectral"/>
+          <w:b/>
+          <w:bCs/>
+          <w:sz w:val="20"/>
+          <w:szCs w:val="20"/>
+        </w:rPr>
+        <w:t>lane detection, traffic-light and directional-sign recognition, dynamic-obstacle handling, Y-junction navigation</w:t>
+      </w:r>
+      <w:r>
+        <w:rPr>
+          <w:rFonts w:ascii="Spectral" w:hAnsi="Spectral" w:cs="Spectral" w:hint="eastAsia"/>
+          <w:b/>
+          <w:bCs/>
+          <w:sz w:val="20"/>
+          <w:szCs w:val="20"/>
+          <w:lang w:eastAsia="ko-KR"/>
+        </w:rPr>
+        <w:t xml:space="preserve"> </w:t>
+      </w:r>
+      <w:r>
+        <w:rPr>
+          <w:rFonts w:ascii="Spectral" w:eastAsia="Spectral" w:hAnsi="Spectral" w:cs="Spectral"/>
+          <w:sz w:val="20"/>
+          <w:szCs w:val="20"/>
+        </w:rPr>
+        <w:t>using OpenCV, NCNN, C++, and Python.</w:t>
       </w:r>
     </w:p>
     <w:p>
@@ -1559,8 +2031,100 @@
           <w:sz w:val="20"/>
           <w:szCs w:val="20"/>
         </w:rPr>
-        <w:t xml:space="preserve">Conducted debugging and performance testing under competition constraints to improve reliability of the perception pipeline. </w:t>
-      </w:r>
+        <w:t>Increased the real-time perception pipeline from</w:t>
+      </w:r>
+      <w:r>
+        <w:rPr>
+          <w:rFonts w:ascii="Spectral" w:hAnsi="Spectral" w:cs="Spectral" w:hint="eastAsia"/>
+          <w:sz w:val="20"/>
+          <w:szCs w:val="20"/>
+          <w:lang w:eastAsia="ko-KR"/>
+        </w:rPr>
+        <w:t xml:space="preserve"> </w:t>
+      </w:r>
+      <w:r>
+        <w:rPr>
+          <w:rFonts w:ascii="Spectral" w:hAnsi="Spectral" w:cs="Spectral"/>
+          <w:sz w:val="20"/>
+          <w:szCs w:val="20"/>
+          <w:lang w:eastAsia="ko-KR"/>
+        </w:rPr>
+        <w:t>6 FPS to a stable 20 FPS</w:t>
+      </w:r>
+      <w:r>
+        <w:t xml:space="preserve"> </w:t>
+      </w:r>
+      <w:r>
+        <w:rPr>
+          <w:rFonts w:ascii="Spectral" w:hAnsi="Spectral" w:cs="Spectral"/>
+          <w:b/>
+          <w:bCs/>
+          <w:sz w:val="20"/>
+          <w:szCs w:val="20"/>
+          <w:lang w:eastAsia="ko-KR"/>
+        </w:rPr>
+        <w:t>—a 3.3× improvement—</w:t>
+      </w:r>
+      <w:r>
+        <w:rPr>
+          <w:rFonts w:ascii="Spectral" w:hAnsi="Spectral" w:cs="Spectral" w:hint="eastAsia"/>
+          <w:sz w:val="20"/>
+          <w:szCs w:val="20"/>
+          <w:lang w:eastAsia="ko-KR"/>
+        </w:rPr>
+        <w:t xml:space="preserve"> </w:t>
+      </w:r>
+      <w:r>
+        <w:rPr>
+          <w:rFonts w:ascii="Spectral" w:hAnsi="Spectral" w:cs="Spectral"/>
+          <w:sz w:val="20"/>
+          <w:szCs w:val="20"/>
+          <w:lang w:eastAsia="ko-KR"/>
+        </w:rPr>
+        <w:t>to identify processing bottlenecks and optimize camera, inference, and ROS2 execution parameters.</w:t>
+      </w:r>
+    </w:p>
+    <w:p>
+      <w:pPr>
+        <w:ind w:left="720"/>
+        <w:rPr>
+          <w:rFonts w:ascii="Spectral" w:hAnsi="Spectral" w:cs="Spectral" w:hint="eastAsia"/>
+          <w:sz w:val="20"/>
+          <w:szCs w:val="20"/>
+          <w:lang w:eastAsia="ko-KR"/>
+        </w:rPr>
+      </w:pPr>
+    </w:p>
+    <w:p>
+      <w:pPr>
+        <w:pBdr>
+          <w:bottom w:val="single" w:sz="6" w:space="1" w:color="000000"/>
+        </w:pBdr>
+        <w:rPr>
+          <w:rFonts w:ascii="Spectral" w:eastAsia="Spectral" w:hAnsi="Spectral" w:cs="Spectral"/>
+          <w:sz w:val="22"/>
+          <w:szCs w:val="22"/>
+        </w:rPr>
+      </w:pPr>
+      <w:r>
+        <w:rPr>
+          <w:rFonts w:ascii="Spectral" w:eastAsia="Spectral" w:hAnsi="Spectral" w:cs="Spectral"/>
+          <w:b/>
+          <w:smallCaps/>
+          <w:sz w:val="22"/>
+          <w:szCs w:val="22"/>
+        </w:rPr>
+        <w:t>LEADERSHIP EXPERIENCE</w:t>
+      </w:r>
+    </w:p>
+    <w:p>
+      <w:pPr>
+        <w:rPr>
+          <w:rFonts w:ascii="Spectral" w:eastAsia="Spectral" w:hAnsi="Spectral" w:cs="Spectral"/>
+          <w:sz w:val="8"/>
+          <w:szCs w:val="8"/>
+        </w:rPr>
+      </w:pPr>
     </w:p>
     <w:p>
       <w:pPr>
@@ -1576,185 +2140,93 @@
       </w:pPr>
       <w:r>
         <w:rPr>
-          <w:rFonts w:ascii="Spectral" w:hAnsi="Spectral" w:cs="Spectral" w:hint="eastAsia"/>
+          <w:rFonts w:asciiTheme="minorEastAsia" w:hAnsiTheme="minorEastAsia" w:cs="Spectral" w:hint="eastAsia"/>
+          <w:b/>
+          <w:sz w:val="22"/>
+          <w:szCs w:val="22"/>
+          <w:lang w:eastAsia="ko-KR"/>
+        </w:rPr>
+        <w:t>Keimyung</w:t>
+      </w:r>
+      <w:r>
+        <w:rPr>
+          <w:rFonts w:ascii="Spectral" w:hAnsi="Spectral" w:cs="Spectral" w:hint="eastAsia"/>
+          <w:b/>
+          <w:sz w:val="22"/>
+          <w:szCs w:val="22"/>
+          <w:lang w:eastAsia="ko-KR"/>
+        </w:rPr>
+        <w:t xml:space="preserve"> University</w:t>
+      </w:r>
+      <w:r>
+        <w:rPr>
+          <w:rFonts w:ascii="Spectral" w:eastAsia="Spectral" w:hAnsi="Spectral" w:cs="Spectral"/>
           <w:b/>
           <w:smallCaps/>
           <w:sz w:val="23"/>
           <w:szCs w:val="23"/>
-          <w:lang w:eastAsia="ko-KR"/>
-        </w:rPr>
-        <w:t xml:space="preserve">KAIST </w:t>
-      </w:r>
-      <w:r>
-        <w:rPr>
-          <w:rFonts w:ascii="Spectral" w:hAnsi="Spectral" w:cs="Spectral"/>
+        </w:rPr>
+        <w:t xml:space="preserve"> | </w:t>
+      </w:r>
+      <w:r>
+        <w:rPr>
+          <w:rFonts w:ascii="Spectral" w:eastAsia="Spectral" w:hAnsi="Spectral" w:cs="Spectral"/>
+          <w:b/>
+          <w:sz w:val="22"/>
+          <w:szCs w:val="22"/>
+        </w:rPr>
+        <w:t>Class Representative &amp; Student Council Member</w:t>
+      </w:r>
+      <w:r>
+        <w:rPr>
+          <w:rFonts w:ascii="Spectral" w:hAnsi="Spectral" w:cs="Spectral" w:hint="eastAsia"/>
+          <w:b/>
+          <w:sz w:val="22"/>
+          <w:szCs w:val="22"/>
+          <w:lang w:eastAsia="ko-KR"/>
+        </w:rPr>
+        <w:t xml:space="preserve"> </w:t>
+      </w:r>
+      <w:r>
+        <w:rPr>
+          <w:rFonts w:ascii="Spectral" w:eastAsia="Spectral" w:hAnsi="Spectral" w:cs="Spectral"/>
           <w:b/>
           <w:smallCaps/>
           <w:sz w:val="23"/>
           <w:szCs w:val="23"/>
-          <w:lang w:eastAsia="ko-KR"/>
-        </w:rPr>
-        <w:t>Mobility</w:t>
-      </w:r>
-      <w:r>
-        <w:rPr>
-          <w:rFonts w:ascii="Spectral" w:hAnsi="Spectral" w:cs="Spectral" w:hint="eastAsia"/>
+        </w:rPr>
+        <w:t xml:space="preserve">| </w:t>
+      </w:r>
+      <w:r>
+        <w:rPr>
+          <w:rFonts w:asciiTheme="minorEastAsia" w:hAnsiTheme="minorEastAsia" w:cs="Spectral" w:hint="eastAsia"/>
           <w:b/>
           <w:smallCaps/>
           <w:sz w:val="23"/>
           <w:szCs w:val="23"/>
           <w:lang w:eastAsia="ko-KR"/>
         </w:rPr>
-        <w:t xml:space="preserve"> Challenge</w:t>
-      </w:r>
-      <w:r>
-        <w:rPr>
-          <w:rFonts w:ascii="Spectral" w:eastAsia="Spectral" w:hAnsi="Spectral" w:cs="Spectral"/>
+        <w:t>Daegu,</w:t>
+      </w:r>
+      <w:r>
+        <w:rPr>
+          <w:rFonts w:ascii="Spectral" w:hAnsi="Spectral" w:cs="Spectral" w:hint="eastAsia"/>
           <w:b/>
           <w:smallCaps/>
           <w:sz w:val="23"/>
           <w:szCs w:val="23"/>
-        </w:rPr>
-        <w:t xml:space="preserve"> </w:t>
-      </w:r>
-      <w:r>
-        <w:rPr>
-          <w:rFonts w:ascii="Spectral" w:hAnsi="Spectral" w:cs="Spectral" w:hint="eastAsia"/>
-          <w:b/>
-          <w:smallCaps/>
-          <w:sz w:val="23"/>
-          <w:szCs w:val="23"/>
-          <w:lang w:eastAsia="ko-KR"/>
-        </w:rPr>
-        <w:t xml:space="preserve">Competition </w:t>
-      </w:r>
-      <w:r>
-        <w:rPr>
-          <w:rFonts w:ascii="Spectral" w:eastAsia="Spectral" w:hAnsi="Spectral" w:cs="Spectral"/>
-          <w:b/>
-          <w:smallCaps/>
-          <w:sz w:val="23"/>
-          <w:szCs w:val="23"/>
-        </w:rPr>
-        <w:t xml:space="preserve">| </w:t>
-      </w:r>
-      <w:r>
-        <w:rPr>
-          <w:rFonts w:ascii="Spectral" w:eastAsia="Spectral" w:hAnsi="Spectral" w:cs="Spectral"/>
-          <w:b/>
-          <w:smallCaps/>
-          <w:sz w:val="23"/>
-          <w:szCs w:val="23"/>
-        </w:rPr>
-        <w:t>Computer Vision / Perception Engineer</w:t>
-      </w:r>
-      <w:r>
-        <w:rPr>
-          <w:rFonts w:ascii="Spectral" w:eastAsia="Spectral" w:hAnsi="Spectral" w:cs="Spectral"/>
-          <w:b/>
-          <w:sz w:val="22"/>
-          <w:szCs w:val="22"/>
-        </w:rPr>
-        <w:t xml:space="preserve"> </w:t>
-      </w:r>
-      <w:r>
-        <w:rPr>
-          <w:rFonts w:ascii="Spectral" w:eastAsia="Spectral" w:hAnsi="Spectral" w:cs="Spectral"/>
-          <w:b/>
-          <w:smallCaps/>
-          <w:sz w:val="20"/>
-          <w:szCs w:val="20"/>
-        </w:rPr>
-        <w:tab/>
-        <w:t xml:space="preserve">  </w:t>
-      </w:r>
-      <w:r>
-        <w:rPr>
-          <w:rFonts w:ascii="Spectral" w:hAnsi="Spectral" w:cs="Spectral" w:hint="eastAsia"/>
-          <w:b/>
-          <w:sz w:val="22"/>
-          <w:szCs w:val="22"/>
-          <w:lang w:eastAsia="ko-KR"/>
-        </w:rPr>
-        <w:t>Dec</w:t>
-      </w:r>
-      <w:r>
-        <w:rPr>
-          <w:rFonts w:ascii="Spectral" w:hAnsi="Spectral" w:cs="Spectral" w:hint="eastAsia"/>
-          <w:b/>
-          <w:sz w:val="22"/>
-          <w:szCs w:val="22"/>
-          <w:lang w:eastAsia="ko-KR"/>
-        </w:rPr>
-        <w:t xml:space="preserve"> </w:t>
-      </w:r>
-      <w:r>
-        <w:rPr>
-          <w:rFonts w:ascii="Spectral" w:eastAsia="Spectral" w:hAnsi="Spectral" w:cs="Spectral"/>
-          <w:b/>
-          <w:sz w:val="22"/>
-          <w:szCs w:val="22"/>
-        </w:rPr>
-        <w:t>202</w:t>
-      </w:r>
-      <w:r>
-        <w:rPr>
-          <w:rFonts w:ascii="Spectral" w:hAnsi="Spectral" w:cs="Spectral" w:hint="eastAsia"/>
-          <w:b/>
-          <w:sz w:val="22"/>
-          <w:szCs w:val="22"/>
-          <w:lang w:eastAsia="ko-KR"/>
-        </w:rPr>
-        <w:t>5</w:t>
-      </w:r>
-      <w:r>
-        <w:rPr>
-          <w:rFonts w:ascii="Spectral" w:eastAsia="Spectral" w:hAnsi="Spectral" w:cs="Spectral"/>
-          <w:b/>
-          <w:sz w:val="22"/>
-          <w:szCs w:val="22"/>
-        </w:rPr>
-        <w:t xml:space="preserve"> –</w:t>
-      </w:r>
-      <w:r>
-        <w:rPr>
-          <w:rFonts w:ascii="Spectral" w:hAnsi="Spectral" w:cs="Spectral" w:hint="eastAsia"/>
-          <w:b/>
-          <w:sz w:val="22"/>
-          <w:szCs w:val="22"/>
-          <w:lang w:eastAsia="ko-KR"/>
-        </w:rPr>
-        <w:t xml:space="preserve"> </w:t>
-      </w:r>
-      <w:r>
-        <w:rPr>
-          <w:rFonts w:ascii="Spectral" w:hAnsi="Spectral" w:cs="Spectral" w:hint="eastAsia"/>
-          <w:b/>
-          <w:sz w:val="22"/>
-          <w:szCs w:val="22"/>
-          <w:lang w:eastAsia="ko-KR"/>
-        </w:rPr>
-        <w:t>Feb</w:t>
-      </w:r>
-      <w:r>
-        <w:rPr>
-          <w:rFonts w:ascii="Spectral" w:hAnsi="Spectral" w:cs="Spectral" w:hint="eastAsia"/>
-          <w:b/>
-          <w:sz w:val="22"/>
-          <w:szCs w:val="22"/>
-          <w:lang w:eastAsia="ko-KR"/>
-        </w:rPr>
-        <w:t xml:space="preserve"> 202</w:t>
-      </w:r>
-      <w:r>
-        <w:rPr>
-          <w:rFonts w:ascii="Spectral" w:hAnsi="Spectral" w:cs="Spectral" w:hint="eastAsia"/>
-          <w:b/>
-          <w:sz w:val="22"/>
-          <w:szCs w:val="22"/>
-          <w:lang w:eastAsia="ko-KR"/>
-        </w:rPr>
-        <w:t>6</w:t>
+          <w:lang w:eastAsia="ko-KR"/>
+        </w:rPr>
+        <w:t xml:space="preserve"> South Korea</w:t>
+      </w:r>
+      <w:r>
+        <w:rPr>
+          <w:rFonts w:ascii="Spectral" w:eastAsia="Spectral" w:hAnsi="Spectral" w:cs="Spectral"/>
+          <w:b/>
+          <w:sz w:val="22"/>
+          <w:szCs w:val="22"/>
+        </w:rPr>
+        <w:t xml:space="preserve">               </w:t>
       </w:r>
     </w:p>
     <w:p>
@@ -1775,290 +2247,19 @@
           <w:sz w:val="20"/>
           <w:szCs w:val="20"/>
         </w:rPr>
-        <w:t>Developed perception components for an autonomous mobility challenge involving camera-based environment understanding and navigation.</w:t>
-      </w:r>
-    </w:p>
-    <w:p>
-      <w:pPr>
-        <w:numPr>
-          <w:ilvl w:val="0"/>
-          <w:numId w:val="1"/>
-        </w:numPr>
-        <w:rPr>
-          <w:rFonts w:ascii="Spectral" w:eastAsia="Spectral" w:hAnsi="Spectral" w:cs="Spectral"/>
-          <w:sz w:val="20"/>
-          <w:szCs w:val="20"/>
-        </w:rPr>
-      </w:pPr>
-      <w:r>
-        <w:rPr>
-          <w:rFonts w:ascii="Spectral" w:eastAsia="Spectral" w:hAnsi="Spectral" w:cs="Spectral"/>
-          <w:sz w:val="20"/>
-          <w:szCs w:val="20"/>
-        </w:rPr>
-        <w:t>Implemented computer vision pipelines using OpenCV and ROS for processing sensor data and supporting real-time decision-making.</w:t>
-      </w:r>
-    </w:p>
-    <w:p>
-      <w:pPr>
-        <w:numPr>
-          <w:ilvl w:val="0"/>
-          <w:numId w:val="1"/>
-        </w:numPr>
-        <w:rPr>
-          <w:rFonts w:ascii="Spectral" w:eastAsia="Spectral" w:hAnsi="Spectral" w:cs="Spectral"/>
-          <w:sz w:val="20"/>
-          <w:szCs w:val="20"/>
-        </w:rPr>
-      </w:pPr>
-      <w:r>
-        <w:rPr>
-          <w:rFonts w:ascii="Spectral" w:eastAsia="Spectral" w:hAnsi="Spectral" w:cs="Spectral"/>
-          <w:sz w:val="20"/>
-          <w:szCs w:val="20"/>
-        </w:rPr>
-        <w:t>Integrated perception outputs with planning and control modules to improve autonomous driving performance during testing.</w:t>
-      </w:r>
-    </w:p>
-    <w:p>
-      <w:pPr>
-        <w:numPr>
-          <w:ilvl w:val="0"/>
-          <w:numId w:val="1"/>
-        </w:numPr>
-        <w:rPr>
-          <w:rFonts w:ascii="Spectral" w:eastAsia="Spectral" w:hAnsi="Spectral" w:cs="Spectral"/>
-          <w:sz w:val="20"/>
-          <w:szCs w:val="20"/>
-        </w:rPr>
-      </w:pPr>
-      <w:r>
-        <w:rPr>
-          <w:rFonts w:ascii="Spectral" w:eastAsia="Spectral" w:hAnsi="Spectral" w:cs="Spectral"/>
-          <w:sz w:val="20"/>
-          <w:szCs w:val="20"/>
-        </w:rPr>
-        <w:t xml:space="preserve">Debugged sensor calibration, perception errors, and system integration issues in preparation for challenge evaluation. </w:t>
-      </w:r>
-    </w:p>
-    <w:p>
-      <w:pPr>
-        <w:rPr>
-          <w:rFonts w:ascii="Spectral" w:hAnsi="Spectral" w:cs="Spectral" w:hint="eastAsia"/>
-          <w:sz w:val="20"/>
-          <w:szCs w:val="20"/>
-          <w:lang w:eastAsia="ko-KR"/>
-        </w:rPr>
-      </w:pPr>
-    </w:p>
-    <w:p>
-      <w:pPr>
-        <w:pBdr>
-          <w:bottom w:val="single" w:sz="6" w:space="1" w:color="000000"/>
-        </w:pBdr>
-        <w:rPr>
-          <w:rFonts w:ascii="Spectral" w:eastAsia="Spectral" w:hAnsi="Spectral" w:cs="Spectral"/>
-          <w:sz w:val="22"/>
-          <w:szCs w:val="22"/>
-        </w:rPr>
-      </w:pPr>
-      <w:r>
-        <w:rPr>
-          <w:rFonts w:ascii="Spectral" w:eastAsia="Spectral" w:hAnsi="Spectral" w:cs="Spectral"/>
-          <w:b/>
-          <w:smallCaps/>
-          <w:sz w:val="22"/>
-          <w:szCs w:val="22"/>
-        </w:rPr>
-        <w:t>LEADERSHIP EXPERIENCE</w:t>
-      </w:r>
-    </w:p>
-    <w:p>
-      <w:pPr>
-        <w:rPr>
-          <w:rFonts w:ascii="Spectral" w:eastAsia="Spectral" w:hAnsi="Spectral" w:cs="Spectral"/>
-          <w:sz w:val="8"/>
-          <w:szCs w:val="8"/>
-        </w:rPr>
-      </w:pPr>
-    </w:p>
-    <w:p>
-      <w:pPr>
-        <w:tabs>
-          <w:tab w:val="left" w:pos="1134"/>
-          <w:tab w:val="right" w:pos="10503"/>
-        </w:tabs>
-        <w:rPr>
-          <w:rFonts w:ascii="Spectral" w:eastAsia="Spectral" w:hAnsi="Spectral" w:cs="Spectral"/>
-          <w:sz w:val="22"/>
-          <w:szCs w:val="22"/>
-        </w:rPr>
-      </w:pPr>
-      <w:r>
-        <w:rPr>
-          <w:rFonts w:asciiTheme="minorEastAsia" w:hAnsiTheme="minorEastAsia" w:cs="Spectral" w:hint="eastAsia"/>
-          <w:b/>
-          <w:sz w:val="22"/>
-          <w:szCs w:val="22"/>
-          <w:lang w:eastAsia="ko-KR"/>
-        </w:rPr>
-        <w:t>Keimyung</w:t>
-      </w:r>
-      <w:r>
-        <w:rPr>
-          <w:rFonts w:ascii="Spectral" w:hAnsi="Spectral" w:cs="Spectral" w:hint="eastAsia"/>
-          <w:b/>
-          <w:sz w:val="22"/>
-          <w:szCs w:val="22"/>
-          <w:lang w:eastAsia="ko-KR"/>
-        </w:rPr>
-        <w:t xml:space="preserve"> University</w:t>
-      </w:r>
-      <w:r>
-        <w:rPr>
-          <w:rFonts w:ascii="Spectral" w:eastAsia="Spectral" w:hAnsi="Spectral" w:cs="Spectral"/>
-          <w:b/>
-          <w:smallCaps/>
-          <w:sz w:val="23"/>
-          <w:szCs w:val="23"/>
-        </w:rPr>
-        <w:t xml:space="preserve"> | </w:t>
-      </w:r>
-      <w:r>
-        <w:rPr>
-          <w:rFonts w:ascii="Spectral" w:eastAsia="Spectral" w:hAnsi="Spectral" w:cs="Spectral"/>
-          <w:b/>
-          <w:sz w:val="22"/>
-          <w:szCs w:val="22"/>
-        </w:rPr>
-        <w:t>Class Representative</w:t>
-      </w:r>
-      <w:r>
-        <w:rPr>
-          <w:rFonts w:ascii="Spectral" w:hAnsi="Spectral" w:cs="Spectral" w:hint="eastAsia"/>
-          <w:b/>
-          <w:sz w:val="22"/>
-          <w:szCs w:val="22"/>
-          <w:lang w:eastAsia="ko-KR"/>
+        <w:t>Served as the primary communication channel between faculty members and students.</w:t>
+      </w:r>
+      <w:r>
+        <w:rPr>
+          <w:rFonts w:ascii="Spectral" w:eastAsia="Spectral" w:hAnsi="Spectral" w:cs="Spectral"/>
+          <w:sz w:val="20"/>
+          <w:szCs w:val="20"/>
         </w:rPr>
         <w:t xml:space="preserve"> </w:t>
       </w:r>
-      <w:r>
-        <w:rPr>
-          <w:rFonts w:ascii="Spectral" w:eastAsia="Spectral" w:hAnsi="Spectral" w:cs="Spectral"/>
-          <w:b/>
-          <w:smallCaps/>
-          <w:sz w:val="23"/>
-          <w:szCs w:val="23"/>
-        </w:rPr>
-        <w:t xml:space="preserve">| </w:t>
-      </w:r>
-      <w:r>
-        <w:rPr>
-          <w:rFonts w:asciiTheme="minorEastAsia" w:hAnsiTheme="minorEastAsia" w:cs="Spectral" w:hint="eastAsia"/>
-          <w:b/>
-          <w:smallCaps/>
-          <w:sz w:val="23"/>
-          <w:szCs w:val="23"/>
-          <w:lang w:eastAsia="ko-KR"/>
-        </w:rPr>
-        <w:t>Daegu,</w:t>
-      </w:r>
-      <w:r>
-        <w:rPr>
-          <w:rFonts w:ascii="Spectral" w:hAnsi="Spectral" w:cs="Spectral" w:hint="eastAsia"/>
-          <w:b/>
-          <w:smallCaps/>
-          <w:sz w:val="23"/>
-          <w:szCs w:val="23"/>
-          <w:lang w:eastAsia="ko-KR"/>
-        </w:rPr>
-        <w:t xml:space="preserve"> South Korea</w:t>
-      </w:r>
-      <w:r>
-        <w:rPr>
-          <w:rFonts w:ascii="Spectral" w:eastAsia="Spectral" w:hAnsi="Spectral" w:cs="Spectral"/>
-          <w:b/>
-          <w:sz w:val="22"/>
-          <w:szCs w:val="22"/>
-        </w:rPr>
-        <w:t xml:space="preserve">               </w:t>
-      </w:r>
-    </w:p>
-    <w:p>
-      <w:pPr>
-        <w:numPr>
-          <w:ilvl w:val="0"/>
-          <w:numId w:val="1"/>
-        </w:numPr>
-        <w:rPr>
-          <w:rFonts w:ascii="Spectral" w:eastAsia="Spectral" w:hAnsi="Spectral" w:cs="Spectral"/>
-          <w:sz w:val="20"/>
-          <w:szCs w:val="20"/>
-        </w:rPr>
-      </w:pPr>
-      <w:r>
-        <w:rPr>
-          <w:rFonts w:ascii="Spectral" w:eastAsia="Spectral" w:hAnsi="Spectral" w:cs="Spectral"/>
-          <w:sz w:val="20"/>
-          <w:szCs w:val="20"/>
-        </w:rPr>
-        <w:t>Served as the primary communication channel between faculty members and students.</w:t>
-      </w:r>
-      <w:r>
-        <w:rPr>
-          <w:rFonts w:ascii="Spectral" w:eastAsia="Spectral" w:hAnsi="Spectral" w:cs="Spectral"/>
-          <w:sz w:val="20"/>
-          <w:szCs w:val="20"/>
-        </w:rPr>
-        <w:t xml:space="preserve"> </w:t>
-      </w:r>
-    </w:p>
-    <w:p>
-      <w:pPr>
-        <w:numPr>
-          <w:ilvl w:val="0"/>
-          <w:numId w:val="1"/>
-        </w:numPr>
-        <w:rPr>
-          <w:rFonts w:ascii="Spectral" w:eastAsia="Spectral" w:hAnsi="Spectral" w:cs="Spectral"/>
-          <w:sz w:val="20"/>
-          <w:szCs w:val="20"/>
-        </w:rPr>
-      </w:pPr>
-      <w:r>
-        <w:rPr>
-          <w:rFonts w:ascii="Spectral" w:eastAsia="Spectral" w:hAnsi="Spectral" w:cs="Spectral"/>
-          <w:sz w:val="20"/>
-          <w:szCs w:val="20"/>
-        </w:rPr>
-        <w:t>Organized academic events, student activities, and departmental programs for over XX students.</w:t>
-      </w:r>
-    </w:p>
-    <w:p>
-      <w:pPr>
-        <w:numPr>
-          <w:ilvl w:val="0"/>
-          <w:numId w:val="1"/>
-        </w:numPr>
-        <w:rPr>
-          <w:rFonts w:ascii="Spectral" w:eastAsia="Spectral" w:hAnsi="Spectral" w:cs="Spectral"/>
-          <w:sz w:val="20"/>
-          <w:szCs w:val="20"/>
-        </w:rPr>
-      </w:pPr>
-      <w:r>
-        <w:rPr>
-          <w:rFonts w:ascii="Spectral" w:eastAsia="Spectral" w:hAnsi="Spectral" w:cs="Spectral"/>
-          <w:sz w:val="20"/>
-          <w:szCs w:val="20"/>
-        </w:rPr>
-        <w:t>Coordinated participation in industry events including G-STAR and student networking activities.</w:t>
-      </w:r>
-    </w:p>
-    <w:p>
-      <w:pPr>
-        <w:pStyle w:val="a5"/>
+    </w:p>
+    <w:p>
+      <w:pPr>
         <w:numPr>
           <w:ilvl w:val="0"/>
           <w:numId w:val="1"/>
@@ -2067,20 +2268,19 @@
           <w:tab w:val="left" w:pos="1134"/>
           <w:tab w:val="right" w:pos="10503"/>
         </w:tabs>
-        <w:ind w:leftChars="0"/>
-        <w:rPr>
-          <w:rFonts w:ascii="Spectral" w:eastAsia="Spectral" w:hAnsi="Spectral" w:cs="Spectral"/>
-          <w:sz w:val="20"/>
-          <w:szCs w:val="20"/>
-        </w:rPr>
-      </w:pPr>
-      <w:r>
-        <w:rPr>
-          <w:rFonts w:ascii="Spectral" w:eastAsia="Spectral" w:hAnsi="Spectral" w:cs="Spectral"/>
-          <w:sz w:val="20"/>
-          <w:szCs w:val="20"/>
-        </w:rPr>
-        <w:t xml:space="preserve">Facilitated communication, conflict resolution, and collaboration among students and faculty. </w:t>
+        <w:rPr>
+          <w:rFonts w:ascii="Spectral" w:eastAsia="Spectral" w:hAnsi="Spectral" w:cs="Spectral"/>
+          <w:sz w:val="20"/>
+          <w:szCs w:val="20"/>
+        </w:rPr>
+      </w:pPr>
+      <w:r>
+        <w:rPr>
+          <w:rFonts w:ascii="Spectral" w:eastAsia="Spectral" w:hAnsi="Spectral" w:cs="Spectral"/>
+          <w:sz w:val="20"/>
+          <w:szCs w:val="20"/>
+        </w:rPr>
+        <w:t xml:space="preserve">Organized academic events, student activities, and departmental programs for over XX students. </w:t>
       </w:r>
     </w:p>
     <w:sectPr>
@@ -3039,6 +3239,29 @@
       <w:ind w:leftChars="400" w:left="800"/>
     </w:pPr>
   </w:style>
+  <w:style w:type="character" w:styleId="a6">
+    <w:name w:val="Hyperlink"/>
+    <w:basedOn w:val="a0"/>
+    <w:uiPriority w:val="99"/>
+    <w:unhideWhenUsed/>
+    <w:rsid w:val="005125B3"/>
+    <w:rPr>
+      <w:color w:val="0000FF" w:themeColor="hyperlink"/>
+      <w:u w:val="single"/>
+    </w:rPr>
+  </w:style>
+  <w:style w:type="character" w:styleId="a7">
+    <w:name w:val="Unresolved Mention"/>
+    <w:basedOn w:val="a0"/>
+    <w:uiPriority w:val="99"/>
+    <w:semiHidden/>
+    <w:unhideWhenUsed/>
+    <w:rsid w:val="005125B3"/>
+    <w:rPr>
+      <w:color w:val="605E5C"/>
+      <w:shd w:val="clear" w:color="auto" w:fill="E1DFDD"/>
+    </w:rPr>
+  </w:style>
 </w:styles>
 </file>
 

</xml_diff>